<commit_message>
feat: add schema inspection, safe SQL execution, and gold set
</commit_message>
<xml_diff>
--- a/docs/PRODUCT_SPEC.docx
+++ b/docs/PRODUCT_SPEC.docx
@@ -127,7 +127,7 @@
                 <w:rFonts w:ascii="Noto Sans CJK SC" w:hAnsi="Noto Sans CJK SC" w:eastAsia="Hiragino Sans GB"/>
                 <w:sz w:val="20"/>
               </w:rPr>
-              <w:t>v1.2</w:t>
+              <w:t>v1.4</w:t>
             </w:r>
           </w:p>
         </w:tc>
@@ -182,7 +182,7 @@
                 <w:rFonts w:ascii="Noto Sans CJK SC" w:hAnsi="Noto Sans CJK SC" w:eastAsia="Hiragino Sans GB"/>
                 <w:sz w:val="20"/>
               </w:rPr>
-              <w:t>DuckDB 基线完成</w:t>
+              <w:t>只读 SQL executor 完成</w:t>
             </w:r>
           </w:p>
         </w:tc>
@@ -292,7 +292,7 @@
                 <w:rFonts w:ascii="Noto Sans CJK SC" w:hAnsi="Noto Sans CJK SC" w:eastAsia="Hiragino Sans GB"/>
                 <w:sz w:val="20"/>
               </w:rPr>
-              <w:t>2026-08-07</w:t>
+              <w:t>2026-08-11</w:t>
             </w:r>
           </w:p>
         </w:tc>
@@ -1095,6 +1095,12 @@
       </w:r>
     </w:p>
     <w:p>
+      <w:pPr/>
+      <w:r>
+        <w:t>9. 实现确定性的只读 SQL executor；单条 SELECT / WITH、危险语句、行数截断和结构化错误测试通过。</w:t>
+      </w:r>
+    </w:p>
+    <w:p>
       <w:pPr>
         <w:pStyle w:val="16"/>
         <w:spacing w:after="20" w:line="276" w:lineRule="auto"/>
@@ -5959,7 +5965,7 @@
         <w:ind w:left="0"/>
       </w:pPr>
       <w:r>
-        <w:t>当前构建脚本将 8 张核心业务 CSV 导入 typed DuckDB，输出到 data/processed/olist.duckdb。MVP 仅使用本地数据；item 与 payment 金额通过独立订单级 view 预聚合。</w:t>
+        <w:t>当前构建脚本将 8 张核心业务 CSV 导入 typed DuckDB，输出到 data/processed/olist.duckdb。MVP 仅使用本地数据；item 与 payment 金额通过独立订单级 view 预聚合。inspect_schema 已基于只读 catalog 查询返回稳定的结构化 Python 数据，包含 table/view、字段、类型、nullable、primary key 和已确认粒度；不生成或执行用户 SQL。</w:t>
       </w:r>
     </w:p>
     <w:tbl>
@@ -6261,7 +6267,7 @@
                 <w:rFonts w:ascii="Noto Sans CJK SC" w:hAnsi="Noto Sans CJK SC" w:eastAsia="Hiragino Sans GB"/>
                 <w:sz w:val="17"/>
               </w:rPr>
-              <w:t>工具可返回表名、字段名、类型、主外键和少量样例。</w:t>
+              <w:t>确定性工具返回 table、view、字段、DuckDB 类型、nullable、primary key 和已确认粒度。</w:t>
             </w:r>
           </w:p>
         </w:tc>
@@ -6311,7 +6317,7 @@
                 <w:rFonts w:ascii="Noto Sans CJK SC" w:hAnsi="Noto Sans CJK SC" w:eastAsia="Hiragino Sans GB"/>
                 <w:sz w:val="17"/>
               </w:rPr>
-              <w:t>Agent 不依赖硬编码即可识别查询相关表。</w:t>
+              <w:t>返回稳定的结构化 Python 数据；数据库不存在时给出明确错误。</w:t>
             </w:r>
           </w:p>
         </w:tc>
@@ -7950,7 +7956,7 @@
         <w:rPr>
           <w:rFonts w:eastAsia="Hiragino Sans GB"/>
         </w:rPr>
-        <w:t>5.4 只读 SQL 生成与执行</w:t>
+        <w:t>5.4 只读 SQL 执行（SQL 生成待实现）</w:t>
       </w:r>
     </w:p>
     <w:p>
@@ -7963,7 +7969,7 @@
         <w:rPr>
           <w:rFonts w:ascii="Noto Sans CJK SC" w:hAnsi="Noto Sans CJK SC" w:eastAsia="Hiragino Sans GB"/>
         </w:rPr>
-        <w:t>SQL 必须基于实时 Schema 生成，不允许凭空使用字段。</w:t>
+        <w:t>run_readonly_sql 接收 DuckDB 路径、单条 SQL 和 max_rows；本阶段不生成 SQL。</w:t>
       </w:r>
     </w:p>
     <w:p>
@@ -7976,7 +7982,7 @@
         <w:rPr>
           <w:rFonts w:ascii="Noto Sans CJK SC" w:hAnsi="Noto Sans CJK SC" w:eastAsia="Hiragino Sans GB"/>
         </w:rPr>
-        <w:t>仅允许 SELECT、WITH 和解释性查询；禁止多语句执行。</w:t>
+        <w:t>只允许单条 SELECT 或 WITH ... SELECT；首关键字 allowlist 与 DuckDB parser 共同校验。</w:t>
       </w:r>
     </w:p>
     <w:p>
@@ -7989,7 +7995,7 @@
         <w:rPr>
           <w:rFonts w:ascii="Noto Sans CJK SC" w:hAnsi="Noto Sans CJK SC" w:eastAsia="Hiragino Sans GB"/>
         </w:rPr>
-        <w:t>默认限制返回行数，例如 LIMIT 200；聚合结果可例外。</w:t>
+        <w:t>使用 fetchmany(max_rows + 1) 判断截断，最多返回 max_rows 行，不改写用户 SQL。</w:t>
       </w:r>
     </w:p>
     <w:p>
@@ -8002,7 +8008,7 @@
         <w:rPr>
           <w:rFonts w:ascii="Noto Sans CJK SC" w:hAnsi="Noto Sans CJK SC" w:eastAsia="Hiragino Sans GB"/>
         </w:rPr>
-        <w:t>执行前通过 AST 或关键词规则进行安全检查。</w:t>
+        <w:t>DuckDB 以 read_only=True 打开，并关闭外部文件访问和 extension 自动安装 / 加载。</w:t>
       </w:r>
     </w:p>
     <w:p>
@@ -8015,7 +8021,7 @@
         <w:rPr>
           <w:rFonts w:ascii="Noto Sans CJK SC" w:hAnsi="Noto Sans CJK SC" w:eastAsia="Hiragino Sans GB"/>
         </w:rPr>
-        <w:t>查询超时、字段错误、表错误时返回结构化错误供 Agent 修复。</w:t>
+        <w:t>结果包含 SQL、列、行、返回行数、truncated、status 和结构化 error。</w:t>
       </w:r>
     </w:p>
     <w:p>
@@ -8028,7 +8034,7 @@
         <w:rPr>
           <w:rFonts w:ascii="Noto Sans CJK SC" w:hAnsi="Noto Sans CJK SC" w:eastAsia="Hiragino Sans GB"/>
         </w:rPr>
-        <w:t>修复次数默认最多 1 次，防止无限循环和成本失控。</w:t>
+        <w:t>当前明确区分不安全、多语句、语法、未知表 / 字段和执行错误；timeout 与自动修复尚未实现。</w:t>
       </w:r>
     </w:p>
     <w:p>
@@ -10838,7 +10844,7 @@
                 <w:rFonts w:ascii="Noto Sans CJK SC" w:hAnsi="Noto Sans CJK SC" w:eastAsia="Hiragino Sans GB"/>
                 <w:sz w:val="16"/>
               </w:rPr>
-              <w:t>读取表、字段、类型、关系和样例。</w:t>
+              <w:t>读取 table、view、字段、类型、nullable、primary key 和已确认粒度。</w:t>
             </w:r>
           </w:p>
         </w:tc>
@@ -10862,7 +10868,7 @@
                 <w:rFonts w:ascii="Noto Sans CJK SC" w:hAnsi="Noto Sans CJK SC" w:eastAsia="Hiragino Sans GB"/>
                 <w:sz w:val="16"/>
               </w:rPr>
-              <w:t>相关业务实体或空输入</w:t>
+              <w:t>DuckDB 文件路径</w:t>
             </w:r>
           </w:p>
         </w:tc>
@@ -10886,7 +10892,7 @@
                 <w:rFonts w:ascii="Noto Sans CJK SC" w:hAnsi="Noto Sans CJK SC" w:eastAsia="Hiragino Sans GB"/>
                 <w:sz w:val="16"/>
               </w:rPr>
-              <w:t>结构化 Schema 摘要</w:t>
+              <w:t>结构化 DatabaseSchema</w:t>
             </w:r>
           </w:p>
         </w:tc>
@@ -11046,7 +11052,7 @@
                 <w:rFonts w:ascii="Noto Sans CJK SC" w:hAnsi="Noto Sans CJK SC" w:eastAsia="Hiragino Sans GB"/>
                 <w:sz w:val="16"/>
               </w:rPr>
-              <w:t>执行安全的只读 SQL。</w:t>
+              <w:t>校验并执行单条只读 SELECT；限制 Python 侧返回行数。</w:t>
             </w:r>
           </w:p>
         </w:tc>
@@ -11070,7 +11076,7 @@
                 <w:rFonts w:ascii="Noto Sans CJK SC" w:hAnsi="Noto Sans CJK SC" w:eastAsia="Hiragino Sans GB"/>
                 <w:sz w:val="16"/>
               </w:rPr>
-              <w:t>SQL、超时、行数限制</w:t>
+              <w:t>DuckDB 路径、SQL、max_rows</w:t>
             </w:r>
           </w:p>
         </w:tc>
@@ -11094,7 +11100,7 @@
                 <w:rFonts w:ascii="Noto Sans CJK SC" w:hAnsi="Noto Sans CJK SC" w:eastAsia="Hiragino Sans GB"/>
                 <w:sz w:val="16"/>
               </w:rPr>
-              <w:t>列名、结果行、耗时、错误</w:t>
+              <w:t>结构化 SQLResult</w:t>
             </w:r>
           </w:p>
         </w:tc>
@@ -16759,7 +16765,7 @@
                 <w:rFonts w:ascii="Noto Sans CJK SC" w:hAnsi="Noto Sans CJK SC" w:eastAsia="Hiragino Sans GB"/>
                 <w:sz w:val="17"/>
               </w:rPr>
-              <w:t>inspect_schema(entity_hint)</w:t>
+              <w:t>inspect_schema(database_path)</w:t>
             </w:r>
           </w:p>
         </w:tc>
@@ -16784,7 +16790,7 @@
                 <w:rFonts w:ascii="Noto Sans CJK SC" w:hAnsi="Noto Sans CJK SC" w:eastAsia="Hiragino Sans GB"/>
                 <w:sz w:val="17"/>
               </w:rPr>
-              <w:t>业务实体提示</w:t>
+              <w:t>DuckDB 文件路径</w:t>
             </w:r>
           </w:p>
         </w:tc>
@@ -16809,7 +16815,7 @@
                 <w:rFonts w:ascii="Noto Sans CJK SC" w:hAnsi="Noto Sans CJK SC" w:eastAsia="Hiragino Sans GB"/>
                 <w:sz w:val="17"/>
               </w:rPr>
-              <w:t>SchemaSummary</w:t>
+              <w:t>DatabaseSchema</w:t>
             </w:r>
           </w:p>
         </w:tc>
@@ -16918,7 +16924,7 @@
                 <w:rFonts w:ascii="Noto Sans CJK SC" w:hAnsi="Noto Sans CJK SC" w:eastAsia="Hiragino Sans GB"/>
                 <w:sz w:val="17"/>
               </w:rPr>
-              <w:t>run_readonly_sql(sql)</w:t>
+              <w:t>run_readonly_sql(database_path, sql, max_rows=200)</w:t>
             </w:r>
           </w:p>
         </w:tc>
@@ -16943,7 +16949,7 @@
                 <w:rFonts w:ascii="Noto Sans CJK SC" w:hAnsi="Noto Sans CJK SC" w:eastAsia="Hiragino Sans GB"/>
                 <w:sz w:val="17"/>
               </w:rPr>
-              <w:t>单条安全 SQL</w:t>
+              <w:t>DuckDB 路径、单条只读 SQL、行数上限</w:t>
             </w:r>
           </w:p>
         </w:tc>
@@ -20726,7 +20732,7 @@
                 <w:rFonts w:ascii="Noto Sans CJK SC" w:hAnsi="Noto Sans CJK SC" w:eastAsia="Hiragino Sans GB"/>
                 <w:sz w:val="17"/>
               </w:rPr>
-              <w:t>8 张核心表的 typed DuckDB、3 个 view 和 14 条 baseline SQL 已完成；Schema 工具待实现。</w:t>
+              <w:t>8 张核心表的 typed DuckDB、3 个 view、14 条 baseline SQL、inspect_schema 和只读 SQL executor 已完成。</w:t>
             </w:r>
           </w:p>
         </w:tc>
@@ -21793,7 +21799,7 @@
                 <w:rFonts w:ascii="Noto Sans CJK SC" w:hAnsi="Noto Sans CJK SC" w:eastAsia="Hiragino Sans GB"/>
                 <w:sz w:val="15"/>
               </w:rPr>
-              <w:t>实现表结构、字段、样例和关系查询。</w:t>
+              <w:t>基于实际 DuckDB catalog 返回 table、view、字段、类型、nullable、primary key 和最小粒度。</w:t>
             </w:r>
           </w:p>
         </w:tc>
@@ -21818,7 +21824,7 @@
                 <w:rFonts w:ascii="Noto Sans CJK SC" w:hAnsi="Noto Sans CJK SC" w:eastAsia="Hiragino Sans GB"/>
                 <w:sz w:val="15"/>
               </w:rPr>
-              <w:t>inspect_schema 可独立测试</w:t>
+              <w:t>已完成：结构化 inspect_schema + 5 项测试</w:t>
             </w:r>
           </w:p>
         </w:tc>
@@ -22001,7 +22007,7 @@
                 <w:rFonts w:ascii="Noto Sans CJK SC" w:hAnsi="Noto Sans CJK SC" w:eastAsia="Hiragino Sans GB"/>
                 <w:sz w:val="15"/>
               </w:rPr>
-              <w:t>实现 SQL 安全检查、超时和行数限制。</w:t>
+              <w:t>实现单 statement 安全检查、read_only 连接、外部访问关闭和返回行数限制；timeout 后续补充。</w:t>
             </w:r>
           </w:p>
         </w:tc>
@@ -22026,7 +22032,7 @@
                 <w:rFonts w:ascii="Noto Sans CJK SC" w:hAnsi="Noto Sans CJK SC" w:eastAsia="Hiragino Sans GB"/>
                 <w:sz w:val="15"/>
               </w:rPr>
-              <w:t>安全执行工具</w:t>
+              <w:t>已完成：结构化 executor + 32 项测试</w:t>
             </w:r>
           </w:p>
         </w:tc>
@@ -25771,7 +25777,7 @@
     </w:p>
     <w:p>
       <w:r>
-        <w:br w:type="page"/>
+        <w:t>8. 实现确定性的 inspect_schema；核心对象、字段类型、缺失数据库和稳定输出测试通过。</w:t>
       </w:r>
     </w:p>
     <w:p>
@@ -26160,29 +26166,45 @@
         <w:color w:val="777777"/>
         <w:sz w:val="16"/>
       </w:rPr>
-      <w:t xml:space="preserve"> 产品需求与技术方案  |  v1.2  |  第 </w:t>
+      <w:t xml:space="preserve"> 产品需求与技术方案  |  v1.4  |  第 </w:t>
     </w:r>
     <w:r>
       <w:rPr>
         <w:rFonts w:ascii="Noto Sans CJK SC" w:hAnsi="Noto Sans CJK SC" w:eastAsia="Hiragino Sans GB"/>
-        <w:color w:val="666666"/>
-        <w:sz w:val="17"/>
+        <w:color w:val="777777"/>
+        <w:sz w:val="16"/>
       </w:rPr>
       <w:fldChar w:fldCharType="begin"/>
     </w:r>
     <w:r>
       <w:rPr>
         <w:rFonts w:ascii="Noto Sans CJK SC" w:hAnsi="Noto Sans CJK SC" w:eastAsia="Hiragino Sans GB"/>
-        <w:color w:val="666666"/>
-        <w:sz w:val="17"/>
+        <w:color w:val="777777"/>
+        <w:sz w:val="16"/>
       </w:rPr>
       <w:instrText xml:space="preserve"> PAGE </w:instrText>
     </w:r>
     <w:r>
       <w:rPr>
         <w:rFonts w:ascii="Noto Sans CJK SC" w:hAnsi="Noto Sans CJK SC" w:eastAsia="Hiragino Sans GB"/>
-        <w:color w:val="666666"/>
-        <w:sz w:val="17"/>
+        <w:color w:val="777777"/>
+        <w:sz w:val="16"/>
+      </w:rPr>
+      <w:fldChar w:fldCharType="separate"/>
+    </w:r>
+    <w:r>
+      <w:rPr>
+        <w:rFonts w:ascii="Noto Sans CJK SC" w:hAnsi="Noto Sans CJK SC" w:eastAsia="Hiragino Sans GB"/>
+        <w:color w:val="777777"/>
+        <w:sz w:val="16"/>
+      </w:rPr>
+      <w:t>1</w:t>
+    </w:r>
+    <w:r>
+      <w:rPr>
+        <w:rFonts w:ascii="Noto Sans CJK SC" w:hAnsi="Noto Sans CJK SC" w:eastAsia="Hiragino Sans GB"/>
+        <w:color w:val="777777"/>
+        <w:sz w:val="16"/>
       </w:rPr>
       <w:fldChar w:fldCharType="end"/>
     </w:r>

</xml_diff>

<commit_message>
docs: update project specification and development guidelines
</commit_message>
<xml_diff>
--- a/docs/PRODUCT_SPEC.docx
+++ b/docs/PRODUCT_SPEC.docx
@@ -118,16 +118,8 @@
             </w:tcMar>
           </w:tcPr>
           <w:p>
-            <w:pPr>
-              <w:spacing w:after="0"/>
-              <w:jc w:val="center"/>
-            </w:pPr>
-            <w:r>
-              <w:rPr>
-                <w:rFonts w:ascii="Noto Sans CJK SC" w:hAnsi="Noto Sans CJK SC" w:eastAsia="Hiragino Sans GB"/>
-                <w:sz w:val="20"/>
-              </w:rPr>
-              <w:t>v1.4</w:t>
+            <w:r>
+              <w:t>v1.5</w:t>
             </w:r>
           </w:p>
         </w:tc>
@@ -173,16 +165,8 @@
             </w:tcMar>
           </w:tcPr>
           <w:p>
-            <w:pPr>
-              <w:spacing w:after="0"/>
-              <w:jc w:val="center"/>
-            </w:pPr>
-            <w:r>
-              <w:rPr>
-                <w:rFonts w:ascii="Noto Sans CJK SC" w:hAnsi="Noto Sans CJK SC" w:eastAsia="Hiragino Sans GB"/>
-                <w:sz w:val="20"/>
-              </w:rPr>
-              <w:t>只读 SQL executor 完成</w:t>
+            <w:r>
+              <w:t>Deterministic agent foundation + English Core Gold Set completed; next stage is minimal English LLM Text-to-SQL generation.</w:t>
             </w:r>
           </w:p>
         </w:tc>
@@ -283,16 +267,8 @@
             </w:tcMar>
           </w:tcPr>
           <w:p>
-            <w:pPr>
-              <w:spacing w:after="0"/>
-              <w:jc w:val="center"/>
-            </w:pPr>
-            <w:r>
-              <w:rPr>
-                <w:rFonts w:ascii="Noto Sans CJK SC" w:hAnsi="Noto Sans CJK SC" w:eastAsia="Hiragino Sans GB"/>
-                <w:sz w:val="20"/>
-              </w:rPr>
-              <w:t>2026-08-11</w:t>
+            <w:r>
+              <w:t>2026-08-12</w:t>
             </w:r>
           </w:p>
         </w:tc>
@@ -1096,9 +1072,7 @@
     </w:p>
     <w:p>
       <w:pPr/>
-      <w:r>
-        <w:t>9. 实现确定性的只读 SQL executor；单条 SELECT / WITH、危险语句、行数截断和结构化错误测试通过。</w:t>
-      </w:r>
+      <w:r/>
     </w:p>
     <w:p>
       <w:pPr>
@@ -1760,29 +1734,10 @@
             </w:tcMar>
           </w:tcPr>
           <w:p>
-            <w:pPr>
-              <w:spacing w:after="40"/>
-            </w:pPr>
-            <w:r>
-              <w:rPr>
-                <w:rFonts w:ascii="Noto Sans CJK SC" w:hAnsi="Noto Sans CJK SC" w:eastAsia="Hiragino Sans GB"/>
-                <w:b/>
-                <w:color w:val="1F4E79"/>
-                <w:sz w:val="21"/>
-              </w:rPr>
+            <w:r>
               <w:t>项目价值主张</w:t>
-            </w:r>
-          </w:p>
-          <w:p>
-            <w:pPr>
-              <w:spacing w:after="0" w:line="264" w:lineRule="auto"/>
-            </w:pPr>
-            <w:r>
-              <w:rPr>
-                <w:rFonts w:ascii="Noto Sans CJK SC" w:hAnsi="Noto Sans CJK SC" w:eastAsia="Hiragino Sans GB"/>
-                <w:sz w:val="19"/>
-              </w:rPr>
-              <w:t>让用户用英文自然语言提出分析任务；让 Agent 在受控权限下完成“理解口径 → 查看数据 → 选择工具 → 执行 → 纠错 → 验证 → 解释”的完整闭环，并确保每个关键结论都能够追溯和复现。</w:t>
+              <w:br/>
+              <w:t>让用户用英文自然语言提出分析任务；让 Agent 在受控权限下完成 understand → retrieve metric context → inspect data → choose tools → execute → repair → validate → explain，并确保每个关键结论都能够追溯和复现。</w:t>
             </w:r>
           </w:p>
         </w:tc>
@@ -1825,17 +1780,7 @@
         <w:ind w:left="0"/>
       </w:pPr>
       <w:r>
-        <w:rPr>
-          <w:rFonts w:hint="eastAsia" w:eastAsia="Hiragino Sans GB"/>
-          <w:lang w:eastAsia="zh-CN"/>
-        </w:rPr>
-        <w:t>Data Analysis Agent</w:t>
-      </w:r>
-      <w:r>
-        <w:rPr>
-          <w:rFonts w:ascii="Noto Sans CJK SC" w:hAnsi="Noto Sans CJK SC" w:eastAsia="Hiragino Sans GB"/>
-        </w:rPr>
-        <w:t xml:space="preserve"> 是一个面向结构化业务数据的多工具分析智能体，可根据英文自然语言问题自主调用指标知识库、数据库、Python 分析和图表工具，并对输出结果进行验证与追溯。</w:t>
+        <w:t>Data Analysis Agent 的产品定位是 Verifiable Multi-Tool Business Data Analysis Agent。系统围绕 understand → retrieve metric context → inspect data → choose tools → execute → repair → validate → explain 构建可验证分析闭环，重点是 controlled tool execution、business metric correctness、error recovery、result validation、traceability 和 quantitative evaluation，而不是单纯的 Text-to-SQL Demo。</w:t>
       </w:r>
     </w:p>
     <w:p>
@@ -4135,15 +4080,8 @@
             <w:vAlign w:val="center"/>
           </w:tcPr>
           <w:p>
-            <w:pPr>
-              <w:spacing w:after="0" w:line="252" w:lineRule="auto"/>
-            </w:pPr>
-            <w:r>
-              <w:rPr>
-                <w:rFonts w:ascii="Noto Sans CJK SC" w:hAnsi="Noto Sans CJK SC" w:eastAsia="Hiragino Sans GB"/>
-                <w:sz w:val="17"/>
-              </w:rPr>
-              <w:t>业务指标 RAG → 口径说明，不执行数据库查询</w:t>
+            <w:r>
+              <w:t>Metric Catalog retrieval → 口径说明，不执行数据库查询</w:t>
             </w:r>
           </w:p>
         </w:tc>
@@ -5007,211 +4945,23 @@
             </w:tcMar>
           </w:tcPr>
           <w:p>
-            <w:pPr>
-              <w:spacing w:after="0" w:line="240" w:lineRule="auto"/>
-            </w:pPr>
-            <w:r>
-              <w:rPr>
-                <w:rFonts w:ascii="Liberation Mono" w:hAnsi="Liberation Mono" w:eastAsia="Hiragino Sans GB"/>
-                <w:color w:val="333333"/>
-                <w:sz w:val="17"/>
-              </w:rPr>
+            <w:r>
               <w:t>用户输入英文自然语言问题</w:t>
-            </w:r>
-            <w:r>
-              <w:rPr>
-                <w:rFonts w:eastAsia="Hiragino Sans GB"/>
-              </w:rPr>
-              <w:br w:type="textWrapping"/>
-            </w:r>
-            <w:r>
-              <w:rPr>
-                <w:rFonts w:ascii="Liberation Mono" w:hAnsi="Liberation Mono" w:eastAsia="Hiragino Sans GB"/>
-                <w:color w:val="333333"/>
-                <w:sz w:val="17"/>
-              </w:rPr>
+              <w:br/>
               <w:t xml:space="preserve">    ↓</w:t>
-            </w:r>
-            <w:r>
-              <w:rPr>
-                <w:rFonts w:eastAsia="Hiragino Sans GB"/>
-              </w:rPr>
-              <w:br w:type="textWrapping"/>
-            </w:r>
-            <w:r>
-              <w:rPr>
-                <w:rFonts w:ascii="Liberation Mono" w:hAnsi="Liberation Mono" w:eastAsia="Hiragino Sans GB"/>
-                <w:color w:val="333333"/>
-                <w:sz w:val="17"/>
-              </w:rPr>
+              <w:br/>
               <w:t>任务理解与问题分类</w:t>
-            </w:r>
-            <w:r>
-              <w:rPr>
-                <w:rFonts w:eastAsia="Hiragino Sans GB"/>
-              </w:rPr>
-              <w:br w:type="textWrapping"/>
-            </w:r>
-            <w:r>
-              <w:rPr>
-                <w:rFonts w:ascii="Liberation Mono" w:hAnsi="Liberation Mono" w:eastAsia="Hiragino Sans GB"/>
-                <w:color w:val="333333"/>
-                <w:sz w:val="17"/>
-              </w:rPr>
+              <w:br/>
+              <w:t xml:space="preserve">    ├─ simple lookup / basic aggregation → schema → SQL → execute → validate</w:t>
+              <w:br/>
+              <w:t xml:space="preserve">    └─ complex diagnostic / multi-step analysis → plan_tools → controlled tools → validate</w:t>
+              <w:br/>
               <w:t xml:space="preserve">    ↓</w:t>
-            </w:r>
-            <w:r>
-              <w:rPr>
-                <w:rFonts w:eastAsia="Hiragino Sans GB"/>
-              </w:rPr>
-              <w:br w:type="textWrapping"/>
-            </w:r>
-            <w:r>
-              <w:rPr>
-                <w:rFonts w:ascii="Liberation Mono" w:hAnsi="Liberation Mono" w:eastAsia="Hiragino Sans GB"/>
-                <w:color w:val="333333"/>
-                <w:sz w:val="17"/>
-              </w:rPr>
-              <w:t>查询业务指标定义（必要时）</w:t>
-            </w:r>
-            <w:r>
-              <w:rPr>
-                <w:rFonts w:eastAsia="Hiragino Sans GB"/>
-              </w:rPr>
-              <w:br w:type="textWrapping"/>
-            </w:r>
-            <w:r>
-              <w:rPr>
-                <w:rFonts w:ascii="Liberation Mono" w:hAnsi="Liberation Mono" w:eastAsia="Hiragino Sans GB"/>
-                <w:color w:val="333333"/>
-                <w:sz w:val="17"/>
-              </w:rPr>
+              <w:br/>
+              <w:t>有限 repair（仅可恢复错误）</w:t>
+              <w:br/>
               <w:t xml:space="preserve">    ↓</w:t>
-            </w:r>
-            <w:r>
-              <w:rPr>
-                <w:rFonts w:eastAsia="Hiragino Sans GB"/>
-              </w:rPr>
-              <w:br w:type="textWrapping"/>
-            </w:r>
-            <w:r>
-              <w:rPr>
-                <w:rFonts w:ascii="Liberation Mono" w:hAnsi="Liberation Mono" w:eastAsia="Hiragino Sans GB"/>
-                <w:color w:val="333333"/>
-                <w:sz w:val="17"/>
-              </w:rPr>
-              <w:t>查看数据库 Schema</w:t>
-            </w:r>
-            <w:r>
-              <w:rPr>
-                <w:rFonts w:eastAsia="Hiragino Sans GB"/>
-              </w:rPr>
-              <w:br w:type="textWrapping"/>
-            </w:r>
-            <w:r>
-              <w:rPr>
-                <w:rFonts w:ascii="Liberation Mono" w:hAnsi="Liberation Mono" w:eastAsia="Hiragino Sans GB"/>
-                <w:color w:val="333333"/>
-                <w:sz w:val="17"/>
-              </w:rPr>
-              <w:t xml:space="preserve">    ↓</w:t>
-            </w:r>
-            <w:r>
-              <w:rPr>
-                <w:rFonts w:eastAsia="Hiragino Sans GB"/>
-              </w:rPr>
-              <w:br w:type="textWrapping"/>
-            </w:r>
-            <w:r>
-              <w:rPr>
-                <w:rFonts w:ascii="Liberation Mono" w:hAnsi="Liberation Mono" w:eastAsia="Hiragino Sans GB"/>
-                <w:color w:val="333333"/>
-                <w:sz w:val="17"/>
-              </w:rPr>
-              <w:t>制定工具调用计划</w:t>
-            </w:r>
-            <w:r>
-              <w:rPr>
-                <w:rFonts w:eastAsia="Hiragino Sans GB"/>
-              </w:rPr>
-              <w:br w:type="textWrapping"/>
-            </w:r>
-            <w:r>
-              <w:rPr>
-                <w:rFonts w:ascii="Liberation Mono" w:hAnsi="Liberation Mono" w:eastAsia="Hiragino Sans GB"/>
-                <w:color w:val="333333"/>
-                <w:sz w:val="17"/>
-              </w:rPr>
-              <w:t xml:space="preserve">    ↓</w:t>
-            </w:r>
-            <w:r>
-              <w:rPr>
-                <w:rFonts w:eastAsia="Hiragino Sans GB"/>
-              </w:rPr>
-              <w:br w:type="textWrapping"/>
-            </w:r>
-            <w:r>
-              <w:rPr>
-                <w:rFonts w:ascii="Liberation Mono" w:hAnsi="Liberation Mono" w:eastAsia="Hiragino Sans GB"/>
-                <w:color w:val="333333"/>
-                <w:sz w:val="17"/>
-              </w:rPr>
-              <w:t>执行只读 SQL / Python 分析 / 图表生成</w:t>
-            </w:r>
-            <w:r>
-              <w:rPr>
-                <w:rFonts w:eastAsia="Hiragino Sans GB"/>
-              </w:rPr>
-              <w:br w:type="textWrapping"/>
-            </w:r>
-            <w:r>
-              <w:rPr>
-                <w:rFonts w:ascii="Liberation Mono" w:hAnsi="Liberation Mono" w:eastAsia="Hiragino Sans GB"/>
-                <w:color w:val="333333"/>
-                <w:sz w:val="17"/>
-              </w:rPr>
-              <w:t xml:space="preserve">    ↓</w:t>
-            </w:r>
-            <w:r>
-              <w:rPr>
-                <w:rFonts w:eastAsia="Hiragino Sans GB"/>
-              </w:rPr>
-              <w:br w:type="textWrapping"/>
-            </w:r>
-            <w:r>
-              <w:rPr>
-                <w:rFonts w:ascii="Liberation Mono" w:hAnsi="Liberation Mono" w:eastAsia="Hiragino Sans GB"/>
-                <w:color w:val="333333"/>
-                <w:sz w:val="17"/>
-              </w:rPr>
-              <w:t>结果校验与失败修复</w:t>
-            </w:r>
-            <w:r>
-              <w:rPr>
-                <w:rFonts w:eastAsia="Hiragino Sans GB"/>
-              </w:rPr>
-              <w:br w:type="textWrapping"/>
-            </w:r>
-            <w:r>
-              <w:rPr>
-                <w:rFonts w:ascii="Liberation Mono" w:hAnsi="Liberation Mono" w:eastAsia="Hiragino Sans GB"/>
-                <w:color w:val="333333"/>
-                <w:sz w:val="17"/>
-              </w:rPr>
-              <w:t xml:space="preserve">    ↓</w:t>
-            </w:r>
-            <w:r>
-              <w:rPr>
-                <w:rFonts w:eastAsia="Hiragino Sans GB"/>
-              </w:rPr>
-              <w:br w:type="textWrapping"/>
-            </w:r>
-            <w:r>
-              <w:rPr>
-                <w:rFonts w:ascii="Liberation Mono" w:hAnsi="Liberation Mono" w:eastAsia="Hiragino Sans GB"/>
-                <w:color w:val="333333"/>
-                <w:sz w:val="17"/>
-              </w:rPr>
+              <w:br/>
               <w:t>生成结论、依据、图表和分析轨迹</w:t>
             </w:r>
           </w:p>
@@ -6155,15 +5905,8 @@
             <w:vAlign w:val="center"/>
           </w:tcPr>
           <w:p>
-            <w:pPr>
-              <w:spacing w:after="0" w:line="252" w:lineRule="auto"/>
-            </w:pPr>
-            <w:r>
-              <w:rPr>
-                <w:rFonts w:ascii="Noto Sans CJK SC" w:hAnsi="Noto Sans CJK SC" w:eastAsia="Hiragino Sans GB"/>
-                <w:sz w:val="17"/>
-              </w:rPr>
-              <w:t>通过初始化脚本将 CSV / Parquet 文件写入数据库。</w:t>
+            <w:r>
+              <w:t>通过初始化脚本将 Olist CSV 写入 typed DuckDB；当前不支持 Parquet。</w:t>
             </w:r>
           </w:p>
         </w:tc>
@@ -6203,15 +5946,8 @@
             <w:vAlign w:val="center"/>
           </w:tcPr>
           <w:p>
-            <w:pPr>
-              <w:spacing w:after="0" w:line="252" w:lineRule="auto"/>
-            </w:pPr>
-            <w:r>
-              <w:rPr>
-                <w:rFonts w:ascii="Noto Sans CJK SC" w:hAnsi="Noto Sans CJK SC" w:eastAsia="Hiragino Sans GB"/>
-                <w:sz w:val="17"/>
-              </w:rPr>
-              <w:t>一条命令可重建数据库，表数量与行数校验通过。</w:t>
+            <w:r>
+              <w:t>一条命令可按 Olist CSV → typed DuckDB 重建数据库，表数量与行数校验通过。</w:t>
             </w:r>
           </w:p>
         </w:tc>
@@ -6543,10 +6279,7 @@
         <w:spacing w:before="120" w:after="100"/>
       </w:pPr>
       <w:r>
-        <w:rPr>
-          <w:rFonts w:eastAsia="Hiragino Sans GB"/>
-        </w:rPr>
-        <w:t>5.2 业务指标知识库（Metric RAG）</w:t>
+        <w:t>5.2 Metric Catalog / Retrieval</w:t>
       </w:r>
     </w:p>
     <w:p>
@@ -6555,10 +6288,25 @@
         <w:ind w:left="0"/>
       </w:pPr>
       <w:r>
-        <w:rPr>
-          <w:rFonts w:ascii="Noto Sans CJK SC" w:hAnsi="Noto Sans CJK SC" w:eastAsia="Hiragino Sans GB"/>
-        </w:rPr>
-        <w:t>数据库字段只能说明“有什么数据”，无法说明“业务上应该怎么算”。系统需要维护指标字典，定义商品金额、支付金额、有效订单、取消订单率、客单价和复购率等口径。</w:t>
+        <w:t>数据库字段只能说明“有什么数据”，无法说明“业务上应该怎么算”。MVP 建立至少 6 个 canonical business metrics，并通过可维护的 Metric Catalog 明确定义商品金额、支付金额、有效订单、取消订单率、客单价和复购率等口径。</w:t>
+      </w:r>
+    </w:p>
+    <w:p>
+      <w:pPr/>
+      <w:r>
+        <w:t>Baseline Query 与 Metric Catalog 是两层概念：前者是人工验证的数据事实 / evaluation reference，后者是产品正式使用的业务指标语义。两者可以对应，但不要求定义完全相同；不得为了匹配 Metric Catalog 静默修改既有 baseline 的含义。</w:t>
+      </w:r>
+    </w:p>
+    <w:p>
+      <w:pPr/>
+      <w:r>
+        <w:t>当前 average_payment_value_per_order baseline 先把有 payment record 的订单聚合到 order grain，再求平均；它不等同于排除 canceled / unavailable 后的 valid-order AOV。total_item_transaction_value baseline 是 SUM(order_items.price)，不含 freight / payment，也不声明为 revenue 或 profit。</w:t>
+      </w:r>
+    </w:p>
+    <w:p>
+      <w:pPr/>
+      <w:r>
+        <w:t>未来定义 avg_order_payment、valid_merchandise_value 等 canonical metric 时必须明确过滤条件；如语义不同，应创建新的对应 baseline，而不是改变旧 baseline。search_metric_definition 第一版优先使用确定性的 catalog / alias / keyword retrieval；embedding / vector retrieval 仅作为指标、业务文档和 glossary 扩大后的 Metric RAG 增强方案，不为 6–10 个指标强制引入 vector database。</w:t>
       </w:r>
     </w:p>
     <w:tbl>
@@ -6695,15 +6443,8 @@
             <w:vAlign w:val="center"/>
           </w:tcPr>
           <w:p>
-            <w:pPr>
-              <w:spacing w:after="0" w:line="252" w:lineRule="auto"/>
-            </w:pPr>
-            <w:r>
-              <w:rPr>
-                <w:rFonts w:ascii="Noto Sans CJK SC" w:hAnsi="Noto Sans CJK SC" w:eastAsia="Hiragino Sans GB"/>
-                <w:sz w:val="17"/>
-              </w:rPr>
-              <w:t>metric_name</w:t>
+            <w:r>
+              <w:t>canonical_identifier</w:t>
             </w:r>
           </w:p>
         </w:tc>
@@ -6719,15 +6460,8 @@
             <w:vAlign w:val="center"/>
           </w:tcPr>
           <w:p>
-            <w:pPr>
-              <w:spacing w:after="0" w:line="252" w:lineRule="auto"/>
-            </w:pPr>
-            <w:r>
-              <w:rPr>
-                <w:rFonts w:ascii="Noto Sans CJK SC" w:hAnsi="Noto Sans CJK SC" w:eastAsia="Hiragino Sans GB"/>
-                <w:sz w:val="17"/>
-              </w:rPr>
-              <w:t>指标名称</w:t>
+            <w:r>
+              <w:t>稳定的英文 canonical identifier</w:t>
             </w:r>
           </w:p>
         </w:tc>
@@ -6743,14 +6477,7 @@
             <w:vAlign w:val="center"/>
           </w:tcPr>
           <w:p>
-            <w:pPr>
-              <w:spacing w:after="0" w:line="252" w:lineRule="auto"/>
-            </w:pPr>
-            <w:r>
-              <w:rPr>
-                <w:rFonts w:ascii="Noto Sans CJK SC" w:hAnsi="Noto Sans CJK SC" w:eastAsia="Hiragino Sans GB"/>
-                <w:sz w:val="17"/>
-              </w:rPr>
+            <w:r>
               <w:t>cancellation_rate</w:t>
             </w:r>
           </w:p>
@@ -6774,15 +6501,8 @@
             <w:vAlign w:val="center"/>
           </w:tcPr>
           <w:p>
-            <w:pPr>
-              <w:spacing w:after="0" w:line="252" w:lineRule="auto"/>
-            </w:pPr>
-            <w:r>
-              <w:rPr>
-                <w:rFonts w:ascii="Noto Sans CJK SC" w:hAnsi="Noto Sans CJK SC" w:eastAsia="Hiragino Sans GB"/>
-                <w:sz w:val="17"/>
-              </w:rPr>
-              <w:t>display_name</w:t>
+            <w:r>
+              <w:t>english_label</w:t>
             </w:r>
           </w:p>
         </w:tc>
@@ -6799,14 +6519,7 @@
             <w:vAlign w:val="center"/>
           </w:tcPr>
           <w:p>
-            <w:pPr>
-              <w:spacing w:after="0" w:line="252" w:lineRule="auto"/>
-            </w:pPr>
-            <w:r>
-              <w:rPr>
-                <w:rFonts w:ascii="Noto Sans CJK SC" w:hAnsi="Noto Sans CJK SC" w:eastAsia="Hiragino Sans GB"/>
-                <w:sz w:val="17"/>
-              </w:rPr>
+            <w:r>
               <w:t>英文展示名</w:t>
             </w:r>
           </w:p>
@@ -6824,14 +6537,7 @@
             <w:vAlign w:val="center"/>
           </w:tcPr>
           <w:p>
-            <w:pPr>
-              <w:spacing w:after="0" w:line="252" w:lineRule="auto"/>
-            </w:pPr>
-            <w:r>
-              <w:rPr>
-                <w:rFonts w:ascii="Noto Sans CJK SC" w:hAnsi="Noto Sans CJK SC" w:eastAsia="Hiragino Sans GB"/>
-                <w:sz w:val="17"/>
-              </w:rPr>
+            <w:r>
               <w:t>Order cancellation rate</w:t>
             </w:r>
           </w:p>
@@ -6854,15 +6560,8 @@
             <w:vAlign w:val="center"/>
           </w:tcPr>
           <w:p>
-            <w:pPr>
-              <w:spacing w:after="0" w:line="252" w:lineRule="auto"/>
-            </w:pPr>
-            <w:r>
-              <w:rPr>
-                <w:rFonts w:ascii="Noto Sans CJK SC" w:hAnsi="Noto Sans CJK SC" w:eastAsia="Hiragino Sans GB"/>
-                <w:sz w:val="17"/>
-              </w:rPr>
-              <w:t>definition</w:t>
+            <w:r>
+              <w:t>aliases / keywords</w:t>
             </w:r>
           </w:p>
         </w:tc>
@@ -6878,15 +6577,8 @@
             <w:vAlign w:val="center"/>
           </w:tcPr>
           <w:p>
-            <w:pPr>
-              <w:spacing w:after="0" w:line="252" w:lineRule="auto"/>
-            </w:pPr>
-            <w:r>
-              <w:rPr>
-                <w:rFonts w:ascii="Noto Sans CJK SC" w:hAnsi="Noto Sans CJK SC" w:eastAsia="Hiragino Sans GB"/>
-                <w:sz w:val="17"/>
-              </w:rPr>
-              <w:t>业务定义</w:t>
+            <w:r>
+              <w:t>确定性检索使用的英文别名和关键词</w:t>
             </w:r>
           </w:p>
         </w:tc>
@@ -6902,15 +6594,8 @@
             <w:vAlign w:val="center"/>
           </w:tcPr>
           <w:p>
-            <w:pPr>
-              <w:spacing w:after="0" w:line="252" w:lineRule="auto"/>
-            </w:pPr>
-            <w:r>
-              <w:rPr>
-                <w:rFonts w:ascii="Noto Sans CJK SC" w:hAnsi="Noto Sans CJK SC" w:eastAsia="Hiragino Sans GB"/>
-                <w:sz w:val="17"/>
-              </w:rPr>
-              <w:t>状态为 canceled 的订单数 / 全部订单数</w:t>
+            <w:r>
+              <w:t>canceled orders, cancellation</w:t>
             </w:r>
           </w:p>
         </w:tc>
@@ -6933,15 +6618,8 @@
             <w:vAlign w:val="center"/>
           </w:tcPr>
           <w:p>
-            <w:pPr>
-              <w:spacing w:after="0" w:line="252" w:lineRule="auto"/>
-            </w:pPr>
-            <w:r>
-              <w:rPr>
-                <w:rFonts w:ascii="Noto Sans CJK SC" w:hAnsi="Noto Sans CJK SC" w:eastAsia="Hiragino Sans GB"/>
-                <w:sz w:val="17"/>
-              </w:rPr>
-              <w:t>formula</w:t>
+            <w:r>
+              <w:t>definition</w:t>
             </w:r>
           </w:p>
         </w:tc>
@@ -6958,15 +6636,8 @@
             <w:vAlign w:val="center"/>
           </w:tcPr>
           <w:p>
-            <w:pPr>
-              <w:spacing w:after="0" w:line="252" w:lineRule="auto"/>
-            </w:pPr>
-            <w:r>
-              <w:rPr>
-                <w:rFonts w:ascii="Noto Sans CJK SC" w:hAnsi="Noto Sans CJK SC" w:eastAsia="Hiragino Sans GB"/>
-                <w:sz w:val="17"/>
-              </w:rPr>
-              <w:t>计算公式或伪 SQL</w:t>
+            <w:r>
+              <w:t>业务定义</w:t>
             </w:r>
           </w:p>
         </w:tc>
@@ -6983,15 +6654,8 @@
             <w:vAlign w:val="center"/>
           </w:tcPr>
           <w:p>
-            <w:pPr>
-              <w:spacing w:after="0" w:line="252" w:lineRule="auto"/>
-            </w:pPr>
-            <w:r>
-              <w:rPr>
-                <w:rFonts w:ascii="Noto Sans CJK SC" w:hAnsi="Noto Sans CJK SC" w:eastAsia="Hiragino Sans GB"/>
-                <w:sz w:val="17"/>
-              </w:rPr>
-              <w:t>canceled_orders / all_orders</w:t>
+            <w:r>
+              <w:t>状态为 canceled 的订单数 / 全部订单数</w:t>
             </w:r>
           </w:p>
         </w:tc>
@@ -7013,15 +6677,8 @@
             <w:vAlign w:val="center"/>
           </w:tcPr>
           <w:p>
-            <w:pPr>
-              <w:spacing w:after="0" w:line="252" w:lineRule="auto"/>
-            </w:pPr>
-            <w:r>
-              <w:rPr>
-                <w:rFonts w:ascii="Noto Sans CJK SC" w:hAnsi="Noto Sans CJK SC" w:eastAsia="Hiragino Sans GB"/>
-                <w:sz w:val="17"/>
-              </w:rPr>
-              <w:t>filters</w:t>
+            <w:r>
+              <w:t>formula</w:t>
             </w:r>
           </w:p>
         </w:tc>
@@ -7037,15 +6694,8 @@
             <w:vAlign w:val="center"/>
           </w:tcPr>
           <w:p>
-            <w:pPr>
-              <w:spacing w:after="0" w:line="252" w:lineRule="auto"/>
-            </w:pPr>
-            <w:r>
-              <w:rPr>
-                <w:rFonts w:ascii="Noto Sans CJK SC" w:hAnsi="Noto Sans CJK SC" w:eastAsia="Hiragino Sans GB"/>
-                <w:sz w:val="17"/>
-              </w:rPr>
-              <w:t>默认过滤条件</w:t>
+            <w:r>
+              <w:t>计算公式或伪 SQL</w:t>
             </w:r>
           </w:p>
         </w:tc>
@@ -7061,15 +6711,8 @@
             <w:vAlign w:val="center"/>
           </w:tcPr>
           <w:p>
-            <w:pPr>
-              <w:spacing w:after="0" w:line="252" w:lineRule="auto"/>
-            </w:pPr>
-            <w:r>
-              <w:rPr>
-                <w:rFonts w:ascii="Noto Sans CJK SC" w:hAnsi="Noto Sans CJK SC" w:eastAsia="Hiragino Sans GB"/>
-                <w:sz w:val="17"/>
-              </w:rPr>
-              <w:t>明确是否包含 canceled / unavailable 订单</w:t>
+            <w:r>
+              <w:t>canceled_orders / all_orders</w:t>
             </w:r>
           </w:p>
         </w:tc>
@@ -7092,15 +6735,8 @@
             <w:vAlign w:val="center"/>
           </w:tcPr>
           <w:p>
-            <w:pPr>
-              <w:spacing w:after="0" w:line="252" w:lineRule="auto"/>
-            </w:pPr>
-            <w:r>
-              <w:rPr>
-                <w:rFonts w:ascii="Noto Sans CJK SC" w:hAnsi="Noto Sans CJK SC" w:eastAsia="Hiragino Sans GB"/>
-                <w:sz w:val="17"/>
-              </w:rPr>
-              <w:t>time_granularity</w:t>
+            <w:r>
+              <w:t>filters</w:t>
             </w:r>
           </w:p>
         </w:tc>
@@ -7117,15 +6753,8 @@
             <w:vAlign w:val="center"/>
           </w:tcPr>
           <w:p>
-            <w:pPr>
-              <w:spacing w:after="0" w:line="252" w:lineRule="auto"/>
-            </w:pPr>
-            <w:r>
-              <w:rPr>
-                <w:rFonts w:ascii="Noto Sans CJK SC" w:hAnsi="Noto Sans CJK SC" w:eastAsia="Hiragino Sans GB"/>
-                <w:sz w:val="17"/>
-              </w:rPr>
-              <w:t>默认时间粒度</w:t>
+            <w:r>
+              <w:t>默认过滤条件</w:t>
             </w:r>
           </w:p>
         </w:tc>
@@ -7142,15 +6771,8 @@
             <w:vAlign w:val="center"/>
           </w:tcPr>
           <w:p>
-            <w:pPr>
-              <w:spacing w:after="0" w:line="252" w:lineRule="auto"/>
-            </w:pPr>
-            <w:r>
-              <w:rPr>
-                <w:rFonts w:ascii="Noto Sans CJK SC" w:hAnsi="Noto Sans CJK SC" w:eastAsia="Hiragino Sans GB"/>
-                <w:sz w:val="17"/>
-              </w:rPr>
-              <w:t>日 / 月 / 季度</w:t>
+            <w:r>
+              <w:t>明确是否包含 canceled / unavailable 订单</w:t>
             </w:r>
           </w:p>
         </w:tc>
@@ -7172,15 +6794,8 @@
             <w:vAlign w:val="center"/>
           </w:tcPr>
           <w:p>
-            <w:pPr>
-              <w:spacing w:after="0" w:line="252" w:lineRule="auto"/>
-            </w:pPr>
-            <w:r>
-              <w:rPr>
-                <w:rFonts w:ascii="Noto Sans CJK SC" w:hAnsi="Noto Sans CJK SC" w:eastAsia="Hiragino Sans GB"/>
-                <w:sz w:val="17"/>
-              </w:rPr>
-              <w:t>source_tables</w:t>
+            <w:r>
+              <w:t>time_granularity</w:t>
             </w:r>
           </w:p>
         </w:tc>
@@ -7196,15 +6811,8 @@
             <w:vAlign w:val="center"/>
           </w:tcPr>
           <w:p>
-            <w:pPr>
-              <w:spacing w:after="0" w:line="252" w:lineRule="auto"/>
-            </w:pPr>
-            <w:r>
-              <w:rPr>
-                <w:rFonts w:ascii="Noto Sans CJK SC" w:hAnsi="Noto Sans CJK SC" w:eastAsia="Hiragino Sans GB"/>
-                <w:sz w:val="17"/>
-              </w:rPr>
-              <w:t>相关数据表</w:t>
+            <w:r>
+              <w:t>默认时间粒度</w:t>
             </w:r>
           </w:p>
         </w:tc>
@@ -7220,15 +6828,8 @@
             <w:vAlign w:val="center"/>
           </w:tcPr>
           <w:p>
-            <w:pPr>
-              <w:spacing w:after="0" w:line="252" w:lineRule="auto"/>
-            </w:pPr>
-            <w:r>
-              <w:rPr>
-                <w:rFonts w:ascii="Noto Sans CJK SC" w:hAnsi="Noto Sans CJK SC" w:eastAsia="Hiragino Sans GB"/>
-                <w:sz w:val="17"/>
-              </w:rPr>
-              <w:t>olist_orders_dataset</w:t>
+            <w:r>
+              <w:t>日 / 月 / 季度</w:t>
             </w:r>
           </w:p>
         </w:tc>
@@ -7251,15 +6852,8 @@
             <w:vAlign w:val="center"/>
           </w:tcPr>
           <w:p>
-            <w:pPr>
-              <w:spacing w:after="0" w:line="252" w:lineRule="auto"/>
-            </w:pPr>
-            <w:r>
-              <w:rPr>
-                <w:rFonts w:ascii="Noto Sans CJK SC" w:hAnsi="Noto Sans CJK SC" w:eastAsia="Hiragino Sans GB"/>
-                <w:sz w:val="17"/>
-              </w:rPr>
-              <w:t>notes</w:t>
+            <w:r>
+              <w:t>source_tables</w:t>
             </w:r>
           </w:p>
         </w:tc>
@@ -7276,15 +6870,8 @@
             <w:vAlign w:val="center"/>
           </w:tcPr>
           <w:p>
-            <w:pPr>
-              <w:spacing w:after="0" w:line="252" w:lineRule="auto"/>
-            </w:pPr>
-            <w:r>
-              <w:rPr>
-                <w:rFonts w:ascii="Noto Sans CJK SC" w:hAnsi="Noto Sans CJK SC" w:eastAsia="Hiragino Sans GB"/>
-                <w:sz w:val="17"/>
-              </w:rPr>
-              <w:t>限制与歧义说明</w:t>
+            <w:r>
+              <w:t>相关数据表</w:t>
             </w:r>
           </w:p>
         </w:tc>
@@ -7301,14 +6888,39 @@
             <w:vAlign w:val="center"/>
           </w:tcPr>
           <w:p>
-            <w:pPr>
-              <w:spacing w:after="0" w:line="252" w:lineRule="auto"/>
-            </w:pPr>
-            <w:r>
-              <w:rPr>
-                <w:rFonts w:ascii="Noto Sans CJK SC" w:hAnsi="Noto Sans CJK SC" w:eastAsia="Hiragino Sans GB"/>
-                <w:sz w:val="17"/>
-              </w:rPr>
+            <w:r>
+              <w:t>orders</w:t>
+            </w:r>
+          </w:p>
+        </w:tc>
+      </w:tr>
+      <w:tr>
+        <w:tc>
+          <w:tcPr>
+            <w:tcW w:type="dxa" w:w="1928"/>
+          </w:tcPr>
+          <w:p>
+            <w:r>
+              <w:t>limitations / notes</w:t>
+            </w:r>
+          </w:p>
+        </w:tc>
+        <w:tc>
+          <w:tcPr>
+            <w:tcW w:type="dxa" w:w="2835"/>
+          </w:tcPr>
+          <w:p>
+            <w:r>
+              <w:t>限制与歧义说明</w:t>
+            </w:r>
+          </w:p>
+        </w:tc>
+        <w:tc>
+          <w:tcPr>
+            <w:tcW w:type="dxa" w:w="4535"/>
+          </w:tcPr>
+          <w:p>
+            <w:r>
               <w:t>商品金额和支付金额不得混用</w:t>
             </w:r>
           </w:p>
@@ -7327,10 +6939,7 @@
         <w:ind w:left="0"/>
       </w:pPr>
       <w:r>
-        <w:rPr>
-          <w:rFonts w:ascii="Noto Sans CJK SC" w:hAnsi="Noto Sans CJK SC" w:eastAsia="Hiragino Sans GB"/>
-        </w:rPr>
-        <w:t>系统应在发现指标词、模糊业务概念或口径冲突时调用 search_metric_definition，而不是直接猜测公式。若没有定义，必须提示用户确认口径。</w:t>
+        <w:t>系统应在发现指标词、模糊业务概念或口径冲突时调用 search_metric_definition，以确定性的 catalog、alias 和 keyword 匹配检索定义；若没有可靠定义，必须提示用户确认口径，不得猜测公式。</w:t>
       </w:r>
     </w:p>
     <w:p>
@@ -8069,10 +7678,7 @@
         <w:ind w:left="0"/>
       </w:pPr>
       <w:r>
-        <w:rPr>
-          <w:rFonts w:ascii="Noto Sans CJK SC" w:hAnsi="Noto Sans CJK SC" w:eastAsia="Hiragino Sans GB"/>
-        </w:rPr>
-        <w:t>对于数据库不便直接完成的任务，Agent 可调用受控 Python 分析函数。MVP 不允许模型执行任意 Python 代码，而是提供参数明确的函数工具。</w:t>
+        <w:t>SQL 能自然、可靠完成的聚合或窗口计算必须留在 SQL，不为了展示 multi-tool 强行转 Python。Python Analysis Tool 只用于 SQL 查询结果上的二次分析，例如 anomaly detection、change decomposition、distribution analysis 和 SQL 不适合承担的统计后处理。MVP 至少实现 2 个真正有区别的受控 Python functions；模型不得执行任意 Python code。</w:t>
       </w:r>
     </w:p>
     <w:tbl>
@@ -10308,324 +9914,33 @@
             </w:tcMar>
           </w:tcPr>
           <w:p>
-            <w:pPr>
-              <w:spacing w:after="0" w:line="240" w:lineRule="auto"/>
-            </w:pPr>
-            <w:r>
-              <w:rPr>
-                <w:rFonts w:ascii="Liberation Mono" w:hAnsi="Liberation Mono" w:eastAsia="Hiragino Sans GB"/>
-                <w:color w:val="333333"/>
-                <w:sz w:val="17"/>
-              </w:rPr>
+            <w:r>
               <w:t>START</w:t>
-            </w:r>
-            <w:r>
-              <w:rPr>
-                <w:rFonts w:eastAsia="Hiragino Sans GB"/>
-              </w:rPr>
-              <w:br w:type="textWrapping"/>
-            </w:r>
-            <w:r>
-              <w:rPr>
-                <w:rFonts w:ascii="Liberation Mono" w:hAnsi="Liberation Mono" w:eastAsia="Hiragino Sans GB"/>
-                <w:color w:val="333333"/>
-                <w:sz w:val="17"/>
-              </w:rPr>
+              <w:br/>
               <w:t xml:space="preserve">  ↓</w:t>
-            </w:r>
-            <w:r>
-              <w:rPr>
-                <w:rFonts w:eastAsia="Hiragino Sans GB"/>
-              </w:rPr>
-              <w:br w:type="textWrapping"/>
-            </w:r>
-            <w:r>
-              <w:rPr>
-                <w:rFonts w:ascii="Liberation Mono" w:hAnsi="Liberation Mono" w:eastAsia="Hiragino Sans GB"/>
-                <w:color w:val="333333"/>
-                <w:sz w:val="17"/>
-              </w:rPr>
+              <w:br/>
               <w:t>classify_task</w:t>
-            </w:r>
-            <w:r>
-              <w:rPr>
-                <w:rFonts w:eastAsia="Hiragino Sans GB"/>
-              </w:rPr>
-              <w:br w:type="textWrapping"/>
-            </w:r>
-            <w:r>
-              <w:rPr>
-                <w:rFonts w:ascii="Liberation Mono" w:hAnsi="Liberation Mono" w:eastAsia="Hiragino Sans GB"/>
-                <w:color w:val="333333"/>
-                <w:sz w:val="17"/>
-              </w:rPr>
+              <w:br/>
               <w:t xml:space="preserve">  ├─ definition → retrieve_metric → compose_answer</w:t>
-            </w:r>
-            <w:r>
-              <w:rPr>
-                <w:rFonts w:eastAsia="Hiragino Sans GB"/>
-              </w:rPr>
-              <w:br w:type="textWrapping"/>
-            </w:r>
-            <w:r>
-              <w:rPr>
-                <w:rFonts w:ascii="Liberation Mono" w:hAnsi="Liberation Mono" w:eastAsia="Hiragino Sans GB"/>
-                <w:color w:val="333333"/>
-                <w:sz w:val="17"/>
-              </w:rPr>
-              <w:t xml:space="preserve">  └─ analysis → retrieve_metric? → inspect_schema → plan_tools</w:t>
-            </w:r>
-            <w:r>
-              <w:rPr>
-                <w:rFonts w:eastAsia="Hiragino Sans GB"/>
-              </w:rPr>
-              <w:br w:type="textWrapping"/>
-            </w:r>
-            <w:r>
-              <w:rPr>
-                <w:rFonts w:ascii="Liberation Mono" w:hAnsi="Liberation Mono" w:eastAsia="Hiragino Sans GB"/>
-                <w:color w:val="333333"/>
-                <w:sz w:val="17"/>
-              </w:rPr>
+              <w:br/>
+              <w:t xml:space="preserve">  ├─ simple → inspect_schema → generate_sql → safety_check → execute_sql → validate_result</w:t>
+              <w:br/>
+              <w:t xml:space="preserve">  └─ complex → plan_tools → inspect_schema / SQL / controlled Python / chart → validate_result</w:t>
+              <w:br/>
               <w:t xml:space="preserve">                                      ↓</w:t>
-            </w:r>
-            <w:r>
-              <w:rPr>
-                <w:rFonts w:eastAsia="Hiragino Sans GB"/>
-              </w:rPr>
-              <w:br w:type="textWrapping"/>
-            </w:r>
-            <w:r>
-              <w:rPr>
-                <w:rFonts w:ascii="Liberation Mono" w:hAnsi="Liberation Mono" w:eastAsia="Hiragino Sans GB"/>
-                <w:color w:val="333333"/>
-                <w:sz w:val="17"/>
-              </w:rPr>
-              <w:t xml:space="preserve">                                  generate_sql</w:t>
-            </w:r>
-            <w:r>
-              <w:rPr>
-                <w:rFonts w:eastAsia="Hiragino Sans GB"/>
-              </w:rPr>
-              <w:br w:type="textWrapping"/>
-            </w:r>
-            <w:r>
-              <w:rPr>
-                <w:rFonts w:ascii="Liberation Mono" w:hAnsi="Liberation Mono" w:eastAsia="Hiragino Sans GB"/>
-                <w:color w:val="333333"/>
-                <w:sz w:val="17"/>
-              </w:rPr>
+              <w:br/>
+              <w:t xml:space="preserve">                         repair_sql (max 1, if recoverable)</w:t>
+              <w:br/>
               <w:t xml:space="preserve">                                      ↓</w:t>
-            </w:r>
-            <w:r>
-              <w:rPr>
-                <w:rFonts w:eastAsia="Hiragino Sans GB"/>
-              </w:rPr>
-              <w:br w:type="textWrapping"/>
-            </w:r>
-            <w:r>
-              <w:rPr>
-                <w:rFonts w:ascii="Liberation Mono" w:hAnsi="Liberation Mono" w:eastAsia="Hiragino Sans GB"/>
-                <w:color w:val="333333"/>
-                <w:sz w:val="17"/>
-              </w:rPr>
-              <w:t xml:space="preserve">                                  safety_check</w:t>
-            </w:r>
-            <w:r>
-              <w:rPr>
-                <w:rFonts w:eastAsia="Hiragino Sans GB"/>
-              </w:rPr>
-              <w:br w:type="textWrapping"/>
-            </w:r>
-            <w:r>
-              <w:rPr>
-                <w:rFonts w:ascii="Liberation Mono" w:hAnsi="Liberation Mono" w:eastAsia="Hiragino Sans GB"/>
-                <w:color w:val="333333"/>
-                <w:sz w:val="17"/>
-              </w:rPr>
+              <w:br/>
+              <w:t xml:space="preserve">                              compose_answer</w:t>
+              <w:br/>
               <w:t xml:space="preserve">                                      ↓</w:t>
-            </w:r>
-            <w:r>
-              <w:rPr>
-                <w:rFonts w:eastAsia="Hiragino Sans GB"/>
-              </w:rPr>
-              <w:br w:type="textWrapping"/>
-            </w:r>
-            <w:r>
-              <w:rPr>
-                <w:rFonts w:ascii="Liberation Mono" w:hAnsi="Liberation Mono" w:eastAsia="Hiragino Sans GB"/>
-                <w:color w:val="333333"/>
-                <w:sz w:val="17"/>
-              </w:rPr>
-              <w:t xml:space="preserve">                                   execute_sql</w:t>
-            </w:r>
-            <w:r>
-              <w:rPr>
-                <w:rFonts w:eastAsia="Hiragino Sans GB"/>
-              </w:rPr>
-              <w:br w:type="textWrapping"/>
-            </w:r>
-            <w:r>
-              <w:rPr>
-                <w:rFonts w:ascii="Liberation Mono" w:hAnsi="Liberation Mono" w:eastAsia="Hiragino Sans GB"/>
-                <w:color w:val="333333"/>
-                <w:sz w:val="17"/>
-              </w:rPr>
-              <w:t xml:space="preserve">                               ┌──────┴──────┐</w:t>
-            </w:r>
-            <w:r>
-              <w:rPr>
-                <w:rFonts w:eastAsia="Hiragino Sans GB"/>
-              </w:rPr>
-              <w:br w:type="textWrapping"/>
-            </w:r>
-            <w:r>
-              <w:rPr>
-                <w:rFonts w:ascii="Liberation Mono" w:hAnsi="Liberation Mono" w:eastAsia="Hiragino Sans GB"/>
-                <w:color w:val="333333"/>
-                <w:sz w:val="17"/>
-              </w:rPr>
-              <w:t xml:space="preserve">                             success        error</w:t>
-            </w:r>
-            <w:r>
-              <w:rPr>
-                <w:rFonts w:eastAsia="Hiragino Sans GB"/>
-              </w:rPr>
-              <w:br w:type="textWrapping"/>
-            </w:r>
-            <w:r>
-              <w:rPr>
-                <w:rFonts w:ascii="Liberation Mono" w:hAnsi="Liberation Mono" w:eastAsia="Hiragino Sans GB"/>
-                <w:color w:val="333333"/>
-                <w:sz w:val="17"/>
-              </w:rPr>
-              <w:t xml:space="preserve">                               ↓              ↓</w:t>
-            </w:r>
-            <w:r>
-              <w:rPr>
-                <w:rFonts w:eastAsia="Hiragino Sans GB"/>
-              </w:rPr>
-              <w:br w:type="textWrapping"/>
-            </w:r>
-            <w:r>
-              <w:rPr>
-                <w:rFonts w:ascii="Liberation Mono" w:hAnsi="Liberation Mono" w:eastAsia="Hiragino Sans GB"/>
-                <w:color w:val="333333"/>
-                <w:sz w:val="17"/>
-              </w:rPr>
-              <w:t xml:space="preserve">                       python_analysis?   repair_sql (max 1)</w:t>
-            </w:r>
-            <w:r>
-              <w:rPr>
-                <w:rFonts w:eastAsia="Hiragino Sans GB"/>
-              </w:rPr>
-              <w:br w:type="textWrapping"/>
-            </w:r>
-            <w:r>
-              <w:rPr>
-                <w:rFonts w:ascii="Liberation Mono" w:hAnsi="Liberation Mono" w:eastAsia="Hiragino Sans GB"/>
-                <w:color w:val="333333"/>
-                <w:sz w:val="17"/>
-              </w:rPr>
-              <w:t xml:space="preserve">                               ↓              ↓</w:t>
-            </w:r>
-            <w:r>
-              <w:rPr>
-                <w:rFonts w:eastAsia="Hiragino Sans GB"/>
-              </w:rPr>
-              <w:br w:type="textWrapping"/>
-            </w:r>
-            <w:r>
-              <w:rPr>
-                <w:rFonts w:ascii="Liberation Mono" w:hAnsi="Liberation Mono" w:eastAsia="Hiragino Sans GB"/>
-                <w:color w:val="333333"/>
-                <w:sz w:val="17"/>
-              </w:rPr>
-              <w:t xml:space="preserve">                        generate_chart?   execute_sql</w:t>
-            </w:r>
-            <w:r>
-              <w:rPr>
-                <w:rFonts w:eastAsia="Hiragino Sans GB"/>
-              </w:rPr>
-              <w:br w:type="textWrapping"/>
-            </w:r>
-            <w:r>
-              <w:rPr>
-                <w:rFonts w:ascii="Liberation Mono" w:hAnsi="Liberation Mono" w:eastAsia="Hiragino Sans GB"/>
-                <w:color w:val="333333"/>
-                <w:sz w:val="17"/>
-              </w:rPr>
-              <w:t xml:space="preserve">                               ↓</w:t>
-            </w:r>
-            <w:r>
-              <w:rPr>
-                <w:rFonts w:eastAsia="Hiragino Sans GB"/>
-              </w:rPr>
-              <w:br w:type="textWrapping"/>
-            </w:r>
-            <w:r>
-              <w:rPr>
-                <w:rFonts w:ascii="Liberation Mono" w:hAnsi="Liberation Mono" w:eastAsia="Hiragino Sans GB"/>
-                <w:color w:val="333333"/>
-                <w:sz w:val="17"/>
-              </w:rPr>
-              <w:t xml:space="preserve">                         validate_result</w:t>
-            </w:r>
-            <w:r>
-              <w:rPr>
-                <w:rFonts w:eastAsia="Hiragino Sans GB"/>
-              </w:rPr>
-              <w:br w:type="textWrapping"/>
-            </w:r>
-            <w:r>
-              <w:rPr>
-                <w:rFonts w:ascii="Liberation Mono" w:hAnsi="Liberation Mono" w:eastAsia="Hiragino Sans GB"/>
-                <w:color w:val="333333"/>
-                <w:sz w:val="17"/>
-              </w:rPr>
-              <w:t xml:space="preserve">                               ↓</w:t>
-            </w:r>
-            <w:r>
-              <w:rPr>
-                <w:rFonts w:eastAsia="Hiragino Sans GB"/>
-              </w:rPr>
-              <w:br w:type="textWrapping"/>
-            </w:r>
-            <w:r>
-              <w:rPr>
-                <w:rFonts w:ascii="Liberation Mono" w:hAnsi="Liberation Mono" w:eastAsia="Hiragino Sans GB"/>
-                <w:color w:val="333333"/>
-                <w:sz w:val="17"/>
-              </w:rPr>
-              <w:t xml:space="preserve">                         compose_answer</w:t>
-            </w:r>
-            <w:r>
-              <w:rPr>
-                <w:rFonts w:eastAsia="Hiragino Sans GB"/>
-              </w:rPr>
-              <w:br w:type="textWrapping"/>
-            </w:r>
-            <w:r>
-              <w:rPr>
-                <w:rFonts w:ascii="Liberation Mono" w:hAnsi="Liberation Mono" w:eastAsia="Hiragino Sans GB"/>
-                <w:color w:val="333333"/>
-                <w:sz w:val="17"/>
-              </w:rPr>
-              <w:t xml:space="preserve">                               ↓</w:t>
-            </w:r>
-            <w:r>
-              <w:rPr>
-                <w:rFonts w:eastAsia="Hiragino Sans GB"/>
-              </w:rPr>
-              <w:br w:type="textWrapping"/>
-            </w:r>
-            <w:r>
-              <w:rPr>
-                <w:rFonts w:ascii="Liberation Mono" w:hAnsi="Liberation Mono" w:eastAsia="Hiragino Sans GB"/>
-                <w:color w:val="333333"/>
-                <w:sz w:val="17"/>
-              </w:rPr>
-              <w:t xml:space="preserve">                              END</w:t>
+              <w:br/>
+              <w:t xml:space="preserve">                                   END</w:t>
+              <w:br/>
+              <w:br/>
+              <w:t>plan_tools is conditional, not mandatory for every task.</w:t>
             </w:r>
           </w:p>
         </w:tc>
@@ -10940,15 +10255,8 @@
             <w:vAlign w:val="center"/>
           </w:tcPr>
           <w:p>
-            <w:pPr>
-              <w:spacing w:after="0" w:line="252" w:lineRule="auto"/>
-            </w:pPr>
-            <w:r>
-              <w:rPr>
-                <w:rFonts w:ascii="Noto Sans CJK SC" w:hAnsi="Noto Sans CJK SC" w:eastAsia="Hiragino Sans GB"/>
-                <w:sz w:val="16"/>
-              </w:rPr>
-              <w:t>检索指标口径和默认过滤条件。</w:t>
+            <w:r>
+              <w:t>从 canonical Metric Catalog 检索指标口径和默认过滤条件；MVP 使用 deterministic alias / keyword retrieval。</w:t>
             </w:r>
           </w:p>
         </w:tc>
@@ -14478,18 +13786,8 @@
             <w:vAlign w:val="center"/>
           </w:tcPr>
           <w:p>
-            <w:pPr>
-              <w:spacing w:after="0"/>
-              <w:jc w:val="center"/>
-            </w:pPr>
-            <w:r>
-              <w:rPr>
-                <w:rFonts w:ascii="Noto Sans CJK SC" w:hAnsi="Noto Sans CJK SC" w:eastAsia="Hiragino Sans GB"/>
-                <w:b/>
-                <w:color w:val="FFFFFF"/>
-                <w:sz w:val="17"/>
-              </w:rPr>
-              <w:t>数量建议</w:t>
+            <w:r>
+              <w:t>完整 evaluation set 目标数量</w:t>
             </w:r>
           </w:p>
         </w:tc>
@@ -15062,184 +14360,35 @@
             </w:tcMar>
           </w:tcPr>
           <w:p>
-            <w:pPr>
-              <w:spacing w:after="0" w:line="240" w:lineRule="auto"/>
-            </w:pPr>
-            <w:r>
-              <w:rPr>
-                <w:rFonts w:ascii="Liberation Mono" w:hAnsi="Liberation Mono" w:eastAsia="Hiragino Sans GB"/>
-                <w:color w:val="333333"/>
-                <w:sz w:val="17"/>
-              </w:rPr>
-              <w:t>Streamlit Web UI</w:t>
-            </w:r>
-            <w:r>
-              <w:rPr>
-                <w:rFonts w:eastAsia="Hiragino Sans GB"/>
-              </w:rPr>
-              <w:br w:type="textWrapping"/>
-            </w:r>
-            <w:r>
-              <w:rPr>
-                <w:rFonts w:ascii="Liberation Mono" w:hAnsi="Liberation Mono" w:eastAsia="Hiragino Sans GB"/>
-                <w:color w:val="333333"/>
-                <w:sz w:val="17"/>
-              </w:rPr>
+            <w:r>
+              <w:t>Streamlit Web UI（later MVP）</w:t>
+              <w:br/>
               <w:t xml:space="preserve">      ↓</w:t>
-            </w:r>
-            <w:r>
-              <w:rPr>
-                <w:rFonts w:eastAsia="Hiragino Sans GB"/>
-              </w:rPr>
-              <w:br w:type="textWrapping"/>
-            </w:r>
-            <w:r>
-              <w:rPr>
-                <w:rFonts w:ascii="Liberation Mono" w:hAnsi="Liberation Mono" w:eastAsia="Hiragino Sans GB"/>
-                <w:color w:val="333333"/>
-                <w:sz w:val="17"/>
-              </w:rPr>
+              <w:br/>
               <w:t>Application Service / Session Manager</w:t>
-            </w:r>
-            <w:r>
-              <w:rPr>
-                <w:rFonts w:eastAsia="Hiragino Sans GB"/>
-              </w:rPr>
-              <w:br w:type="textWrapping"/>
-            </w:r>
-            <w:r>
-              <w:rPr>
-                <w:rFonts w:ascii="Liberation Mono" w:hAnsi="Liberation Mono" w:eastAsia="Hiragino Sans GB"/>
-                <w:color w:val="333333"/>
-                <w:sz w:val="17"/>
-              </w:rPr>
+              <w:br/>
               <w:t xml:space="preserve">      ↓</w:t>
-            </w:r>
-            <w:r>
-              <w:rPr>
-                <w:rFonts w:eastAsia="Hiragino Sans GB"/>
-              </w:rPr>
-              <w:br w:type="textWrapping"/>
-            </w:r>
-            <w:r>
-              <w:rPr>
-                <w:rFonts w:ascii="Liberation Mono" w:hAnsi="Liberation Mono" w:eastAsia="Hiragino Sans GB"/>
-                <w:color w:val="333333"/>
-                <w:sz w:val="17"/>
-              </w:rPr>
-              <w:t>LangGraph（或等价状态机）Agent Workflow</w:t>
-            </w:r>
-            <w:r>
-              <w:rPr>
-                <w:rFonts w:eastAsia="Hiragino Sans GB"/>
-              </w:rPr>
-              <w:br w:type="textWrapping"/>
-            </w:r>
-            <w:r>
-              <w:rPr>
-                <w:rFonts w:ascii="Liberation Mono" w:hAnsi="Liberation Mono" w:eastAsia="Hiragino Sans GB"/>
-                <w:color w:val="333333"/>
-                <w:sz w:val="17"/>
-              </w:rPr>
-              <w:t xml:space="preserve">      ├── Metric RAG（本地向量索引）</w:t>
-            </w:r>
-            <w:r>
-              <w:rPr>
-                <w:rFonts w:eastAsia="Hiragino Sans GB"/>
-              </w:rPr>
-              <w:br w:type="textWrapping"/>
-            </w:r>
-            <w:r>
-              <w:rPr>
-                <w:rFonts w:ascii="Liberation Mono" w:hAnsi="Liberation Mono" w:eastAsia="Hiragino Sans GB"/>
-                <w:color w:val="333333"/>
-                <w:sz w:val="17"/>
-              </w:rPr>
+              <w:br/>
+              <w:t>Single Agent + explicit workflow/state</w:t>
+              <w:br/>
+              <w:t xml:space="preserve">      ├── Metric Catalog / deterministic retrieval</w:t>
+              <w:br/>
               <w:t xml:space="preserve">      ├── Schema Inspector</w:t>
-            </w:r>
-            <w:r>
-              <w:rPr>
-                <w:rFonts w:eastAsia="Hiragino Sans GB"/>
-              </w:rPr>
-              <w:br w:type="textWrapping"/>
-            </w:r>
-            <w:r>
-              <w:rPr>
-                <w:rFonts w:ascii="Liberation Mono" w:hAnsi="Liberation Mono" w:eastAsia="Hiragino Sans GB"/>
-                <w:color w:val="333333"/>
-                <w:sz w:val="17"/>
-              </w:rPr>
+              <w:br/>
               <w:t xml:space="preserve">      ├── Read-only SQL Executor</w:t>
-            </w:r>
-            <w:r>
-              <w:rPr>
-                <w:rFonts w:eastAsia="Hiragino Sans GB"/>
-              </w:rPr>
-              <w:br w:type="textWrapping"/>
-            </w:r>
-            <w:r>
-              <w:rPr>
-                <w:rFonts w:ascii="Liberation Mono" w:hAnsi="Liberation Mono" w:eastAsia="Hiragino Sans GB"/>
-                <w:color w:val="333333"/>
-                <w:sz w:val="17"/>
-              </w:rPr>
-              <w:t xml:space="preserve">      ├── Python Analysis Tools</w:t>
-            </w:r>
-            <w:r>
-              <w:rPr>
-                <w:rFonts w:eastAsia="Hiragino Sans GB"/>
-              </w:rPr>
-              <w:br w:type="textWrapping"/>
-            </w:r>
-            <w:r>
-              <w:rPr>
-                <w:rFonts w:ascii="Liberation Mono" w:hAnsi="Liberation Mono" w:eastAsia="Hiragino Sans GB"/>
-                <w:color w:val="333333"/>
-                <w:sz w:val="17"/>
-              </w:rPr>
+              <w:br/>
+              <w:t xml:space="preserve">      ├── Controlled Python Analysis</w:t>
+              <w:br/>
               <w:t xml:space="preserve">      ├── Chart Generator</w:t>
-            </w:r>
-            <w:r>
-              <w:rPr>
-                <w:rFonts w:eastAsia="Hiragino Sans GB"/>
-              </w:rPr>
-              <w:br w:type="textWrapping"/>
-            </w:r>
-            <w:r>
-              <w:rPr>
-                <w:rFonts w:ascii="Liberation Mono" w:hAnsi="Liberation Mono" w:eastAsia="Hiragino Sans GB"/>
-                <w:color w:val="333333"/>
-                <w:sz w:val="17"/>
-              </w:rPr>
+              <w:br/>
               <w:t xml:space="preserve">      └── Result Validator</w:t>
-            </w:r>
-            <w:r>
-              <w:rPr>
-                <w:rFonts w:eastAsia="Hiragino Sans GB"/>
-              </w:rPr>
-              <w:br w:type="textWrapping"/>
-            </w:r>
-            <w:r>
-              <w:rPr>
-                <w:rFonts w:ascii="Liberation Mono" w:hAnsi="Liberation Mono" w:eastAsia="Hiragino Sans GB"/>
-                <w:color w:val="333333"/>
-                <w:sz w:val="17"/>
-              </w:rPr>
+              <w:br/>
               <w:t xml:space="preserve">      ↓</w:t>
-            </w:r>
-            <w:r>
-              <w:rPr>
-                <w:rFonts w:eastAsia="Hiragino Sans GB"/>
-              </w:rPr>
-              <w:br w:type="textWrapping"/>
-            </w:r>
-            <w:r>
-              <w:rPr>
-                <w:rFonts w:ascii="Liberation Mono" w:hAnsi="Liberation Mono" w:eastAsia="Hiragino Sans GB"/>
-                <w:color w:val="333333"/>
-                <w:sz w:val="17"/>
-              </w:rPr>
+              <w:br/>
               <w:t>DuckDB + Local Files + Evaluation Store</w:t>
+              <w:br/>
+              <w:br/>
+              <w:t>LangGraph is preferred only at workflow integration; vector retrieval and MCP are post-MVP extensions.</w:t>
             </w:r>
           </w:p>
         </w:tc>
@@ -15501,15 +14650,8 @@
             <w:vAlign w:val="center"/>
           </w:tcPr>
           <w:p>
-            <w:pPr>
-              <w:spacing w:after="0" w:line="252" w:lineRule="auto"/>
-            </w:pPr>
-            <w:r>
-              <w:rPr>
-                <w:rFonts w:ascii="Noto Sans CJK SC" w:hAnsi="Noto Sans CJK SC" w:eastAsia="Hiragino Sans GB"/>
-                <w:sz w:val="16"/>
-              </w:rPr>
-              <w:t>LangGraph 或自定义显式状态机</w:t>
+            <w:r>
+              <w:t>先使用 single Agent + explicit workflow/state；workflow integration 阶段优先考虑 LangGraph</w:t>
             </w:r>
           </w:p>
         </w:tc>
@@ -15526,15 +14668,8 @@
             <w:vAlign w:val="center"/>
           </w:tcPr>
           <w:p>
-            <w:pPr>
-              <w:spacing w:after="0" w:line="252" w:lineRule="auto"/>
-            </w:pPr>
-            <w:r>
-              <w:rPr>
-                <w:rFonts w:ascii="Noto Sans CJK SC" w:hAnsi="Noto Sans CJK SC" w:eastAsia="Hiragino Sans GB"/>
-                <w:sz w:val="16"/>
-              </w:rPr>
-              <w:t>可展示节点、状态、分支和错误恢复。</w:t>
+            <w:r>
+              <w:t>后续需要 state、conditional routing、retry、repair 和 trace；当前阶段不提前引入 LangGraph。</w:t>
             </w:r>
           </w:p>
         </w:tc>
@@ -15874,15 +15009,8 @@
             <w:vAlign w:val="center"/>
           </w:tcPr>
           <w:p>
-            <w:pPr>
-              <w:spacing w:after="0" w:line="252" w:lineRule="auto"/>
-            </w:pPr>
-            <w:r>
-              <w:rPr>
-                <w:rFonts w:ascii="Noto Sans CJK SC" w:hAnsi="Noto Sans CJK SC" w:eastAsia="Hiragino Sans GB"/>
-                <w:sz w:val="16"/>
-              </w:rPr>
-              <w:t>RAG</w:t>
+            <w:r>
+              <w:t>Metric retrieval</w:t>
             </w:r>
           </w:p>
         </w:tc>
@@ -15898,15 +15026,8 @@
             <w:vAlign w:val="center"/>
           </w:tcPr>
           <w:p>
-            <w:pPr>
-              <w:spacing w:after="0" w:line="252" w:lineRule="auto"/>
-            </w:pPr>
-            <w:r>
-              <w:rPr>
-                <w:rFonts w:ascii="Noto Sans CJK SC" w:hAnsi="Noto Sans CJK SC" w:eastAsia="Hiragino Sans GB"/>
-                <w:sz w:val="16"/>
-              </w:rPr>
-              <w:t>轻量向量索引或嵌入检索</w:t>
+            <w:r>
+              <w:t>确定性 Metric Catalog / alias / keyword retrieval</w:t>
             </w:r>
           </w:p>
         </w:tc>
@@ -15922,15 +15043,8 @@
             <w:vAlign w:val="center"/>
           </w:tcPr>
           <w:p>
-            <w:pPr>
-              <w:spacing w:after="0" w:line="252" w:lineRule="auto"/>
-            </w:pPr>
-            <w:r>
-              <w:rPr>
-                <w:rFonts w:ascii="Noto Sans CJK SC" w:hAnsi="Noto Sans CJK SC" w:eastAsia="Hiragino Sans GB"/>
-                <w:sz w:val="16"/>
-              </w:rPr>
-              <w:t>仅用于指标口径，不构建庞大知识库。</w:t>
+            <w:r>
+              <w:t>6–10 个指标不引入 vector database；embedding / vector retrieval 仅在语料规模扩大后增强。</w:t>
             </w:r>
           </w:p>
         </w:tc>
@@ -16090,6 +15204,70 @@
                 <w:sz w:val="16"/>
               </w:rPr>
               <w:t>验证工具、SQL 安全和端到端准确性。</w:t>
+            </w:r>
+          </w:p>
+        </w:tc>
+      </w:tr>
+      <w:tr>
+        <w:tc>
+          <w:tcPr>
+            <w:tcW w:type="dxa" w:w="1701"/>
+          </w:tcPr>
+          <w:p>
+            <w:r>
+              <w:t>LangChain</w:t>
+            </w:r>
+          </w:p>
+        </w:tc>
+        <w:tc>
+          <w:tcPr>
+            <w:tcW w:type="dxa" w:w="3118"/>
+          </w:tcPr>
+          <w:p>
+            <w:r>
+              <w:t>非硬性要求</w:t>
+            </w:r>
+          </w:p>
+        </w:tc>
+        <w:tc>
+          <w:tcPr>
+            <w:tcW w:type="dxa" w:w="4252"/>
+          </w:tcPr>
+          <w:p>
+            <w:r>
+              <w:t>仅在 model / tool / structured-output abstraction 确有收益时采用。</w:t>
+            </w:r>
+          </w:p>
+        </w:tc>
+      </w:tr>
+      <w:tr>
+        <w:tc>
+          <w:tcPr>
+            <w:tcW w:type="dxa" w:w="1701"/>
+          </w:tcPr>
+          <w:p>
+            <w:r>
+              <w:t>MCP</w:t>
+            </w:r>
+          </w:p>
+        </w:tc>
+        <w:tc>
+          <w:tcPr>
+            <w:tcW w:type="dxa" w:w="3118"/>
+          </w:tcPr>
+          <w:p>
+            <w:r>
+              <w:t>post-MVP extension</w:t>
+            </w:r>
+          </w:p>
+        </w:tc>
+        <w:tc>
+          <w:tcPr>
+            <w:tcW w:type="dxa" w:w="4252"/>
+          </w:tcPr>
+          <w:p>
+            <w:r>
+              <w:t>当前本地 DuckDB + Python tools 没有真实 MCP 边界。</w:t>
             </w:r>
           </w:p>
         </w:tc>
@@ -18097,15 +17275,8 @@
             <w:vAlign w:val="center"/>
           </w:tcPr>
           <w:p>
-            <w:pPr>
-              <w:spacing w:after="0" w:line="252" w:lineRule="auto"/>
-            </w:pPr>
-            <w:r>
-              <w:rPr>
-                <w:rFonts w:ascii="Noto Sans CJK SC" w:hAnsi="Noto Sans CJK SC" w:eastAsia="Hiragino Sans GB"/>
-                <w:sz w:val="17"/>
-              </w:rPr>
-              <w:t>非聚合查询自动添加 LIMIT。</w:t>
+            <w:r>
+              <w:t>不改写用户 SQL；executor 使用 fetchmany(max_rows + 1)，最多向应用层返回 max_rows 行，并用 truncated 表示是否仍有更多结果。</w:t>
             </w:r>
           </w:p>
         </w:tc>
@@ -18121,15 +17292,8 @@
             <w:vAlign w:val="center"/>
           </w:tcPr>
           <w:p>
-            <w:pPr>
-              <w:spacing w:after="0" w:line="252" w:lineRule="auto"/>
-            </w:pPr>
-            <w:r>
-              <w:rPr>
-                <w:rFonts w:ascii="Noto Sans CJK SC" w:hAnsi="Noto Sans CJK SC" w:eastAsia="Hiragino Sans GB"/>
-                <w:sz w:val="17"/>
-              </w:rPr>
-              <w:t>大结果查询返回不超过配置上限。</w:t>
+            <w:r>
+              <w:t>大结果查询返回不超过配置上限；原 SQL 保留用于 reproducibility / tracing / auditing。</w:t>
             </w:r>
           </w:p>
         </w:tc>
@@ -18177,15 +17341,8 @@
             <w:vAlign w:val="center"/>
           </w:tcPr>
           <w:p>
-            <w:pPr>
-              <w:spacing w:after="0" w:line="252" w:lineRule="auto"/>
-            </w:pPr>
-            <w:r>
-              <w:rPr>
-                <w:rFonts w:ascii="Noto Sans CJK SC" w:hAnsi="Noto Sans CJK SC" w:eastAsia="Hiragino Sans GB"/>
-                <w:sz w:val="17"/>
-              </w:rPr>
-              <w:t>超过阈值自动中止。</w:t>
+            <w:r>
+              <w:t>query timeout / resource quota 当前尚未实现；列为 reliability hardening / later MVP task。</w:t>
             </w:r>
           </w:p>
         </w:tc>
@@ -18202,15 +17359,8 @@
             <w:vAlign w:val="center"/>
           </w:tcPr>
           <w:p>
-            <w:pPr>
-              <w:spacing w:after="0" w:line="252" w:lineRule="auto"/>
-            </w:pPr>
-            <w:r>
-              <w:rPr>
-                <w:rFonts w:ascii="Noto Sans CJK SC" w:hAnsi="Noto Sans CJK SC" w:eastAsia="Hiragino Sans GB"/>
-                <w:sz w:val="17"/>
-              </w:rPr>
-              <w:t>构造慢查询验证。</w:t>
+            <w:r>
+              <w:t>实现后再用慢查询与资源边界测试验收。</w:t>
             </w:r>
           </w:p>
         </w:tc>
@@ -18988,6 +18138,12 @@
         <w:t>10.2 评测数据格式</w:t>
       </w:r>
     </w:p>
+    <w:p>
+      <w:pPr/>
+      <w:r>
+        <w:t>当前 English Core Gold Set v0.1 已完成：16 questions（14 answerable、2 unanswerable），覆盖 basic queries、aggregation、multi-table、delivery analysis、grain-sensitive questions 和 unsupported questions；完整 pytest 为 63 passed。它用于验证问题理解、table / grain / metric 选择和最终结果，不要求模型逐字符复制 reference SQL。</w:t>
+      </w:r>
+    </w:p>
     <w:tbl>
       <w:tblPr>
         <w:tblStyle w:val="32"/>
@@ -19026,141 +18182,25 @@
             </w:tcMar>
           </w:tcPr>
           <w:p>
-            <w:pPr>
-              <w:spacing w:after="0" w:line="240" w:lineRule="auto"/>
-            </w:pPr>
-            <w:r>
-              <w:rPr>
-                <w:rFonts w:ascii="Liberation Mono" w:hAnsi="Liberation Mono" w:eastAsia="Hiragino Sans GB"/>
-                <w:color w:val="333333"/>
-                <w:sz w:val="17"/>
-              </w:rPr>
+            <w:r>
               <w:t>{</w:t>
-            </w:r>
-            <w:r>
-              <w:rPr>
-                <w:rFonts w:eastAsia="Hiragino Sans GB"/>
-              </w:rPr>
-              <w:br w:type="textWrapping"/>
-            </w:r>
-            <w:r>
-              <w:rPr>
-                <w:rFonts w:ascii="Liberation Mono" w:hAnsi="Liberation Mono" w:eastAsia="Hiragino Sans GB"/>
-                <w:color w:val="333333"/>
-                <w:sz w:val="17"/>
-              </w:rPr>
+              <w:br/>
               <w:t xml:space="preserve">  "case_id": "trend_001",</w:t>
-            </w:r>
-            <w:r>
-              <w:rPr>
-                <w:rFonts w:eastAsia="Hiragino Sans GB"/>
-              </w:rPr>
-              <w:br w:type="textWrapping"/>
-            </w:r>
-            <w:r>
-              <w:rPr>
-                <w:rFonts w:ascii="Liberation Mono" w:hAnsi="Liberation Mono" w:eastAsia="Hiragino Sans GB"/>
-                <w:color w:val="333333"/>
-                <w:sz w:val="17"/>
-              </w:rPr>
+              <w:br/>
               <w:t xml:space="preserve">  "question": "Which month had the largest month-over-month decline in merchandise value?",</w:t>
-            </w:r>
-            <w:r>
-              <w:rPr>
-                <w:rFonts w:eastAsia="Hiragino Sans GB"/>
-              </w:rPr>
-              <w:br w:type="textWrapping"/>
-            </w:r>
-            <w:r>
-              <w:rPr>
-                <w:rFonts w:ascii="Liberation Mono" w:hAnsi="Liberation Mono" w:eastAsia="Hiragino Sans GB"/>
-                <w:color w:val="333333"/>
-                <w:sz w:val="17"/>
-              </w:rPr>
+              <w:br/>
               <w:t xml:space="preserve">  "task_type": "trend",</w:t>
-            </w:r>
-            <w:r>
-              <w:rPr>
-                <w:rFonts w:eastAsia="Hiragino Sans GB"/>
-              </w:rPr>
-              <w:br w:type="textWrapping"/>
-            </w:r>
-            <w:r>
-              <w:rPr>
-                <w:rFonts w:ascii="Liberation Mono" w:hAnsi="Liberation Mono" w:eastAsia="Hiragino Sans GB"/>
-                <w:color w:val="333333"/>
-                <w:sz w:val="17"/>
-              </w:rPr>
+              <w:br/>
               <w:t xml:space="preserve">  "expected_tools": ["inspect_schema", "run_readonly_sql", "run_python_analysis"],</w:t>
-            </w:r>
-            <w:r>
-              <w:rPr>
-                <w:rFonts w:eastAsia="Hiragino Sans GB"/>
-              </w:rPr>
-              <w:br w:type="textWrapping"/>
-            </w:r>
-            <w:r>
-              <w:rPr>
-                <w:rFonts w:ascii="Liberation Mono" w:hAnsi="Liberation Mono" w:eastAsia="Hiragino Sans GB"/>
-                <w:color w:val="333333"/>
-                <w:sz w:val="17"/>
-              </w:rPr>
+              <w:br/>
               <w:t xml:space="preserve">  "gold_sql": "SELECT ...",</w:t>
-            </w:r>
-            <w:r>
-              <w:rPr>
-                <w:rFonts w:eastAsia="Hiragino Sans GB"/>
-              </w:rPr>
-              <w:br w:type="textWrapping"/>
-            </w:r>
-            <w:r>
-              <w:rPr>
-                <w:rFonts w:ascii="Liberation Mono" w:hAnsi="Liberation Mono" w:eastAsia="Hiragino Sans GB"/>
-                <w:color w:val="333333"/>
-                <w:sz w:val="17"/>
-              </w:rPr>
+              <w:br/>
               <w:t xml:space="preserve">  "expected_answer": {"month": "2018-06", "change_rate": -0.18},</w:t>
-            </w:r>
-            <w:r>
-              <w:rPr>
-                <w:rFonts w:eastAsia="Hiragino Sans GB"/>
-              </w:rPr>
-              <w:br w:type="textWrapping"/>
-            </w:r>
-            <w:r>
-              <w:rPr>
-                <w:rFonts w:ascii="Liberation Mono" w:hAnsi="Liberation Mono" w:eastAsia="Hiragino Sans GB"/>
-                <w:color w:val="333333"/>
-                <w:sz w:val="17"/>
-              </w:rPr>
+              <w:br/>
               <w:t xml:space="preserve">  "tolerance": 0.001,</w:t>
-            </w:r>
-            <w:r>
-              <w:rPr>
-                <w:rFonts w:eastAsia="Hiragino Sans GB"/>
-              </w:rPr>
-              <w:br w:type="textWrapping"/>
-            </w:r>
-            <w:r>
-              <w:rPr>
-                <w:rFonts w:ascii="Liberation Mono" w:hAnsi="Liberation Mono" w:eastAsia="Hiragino Sans GB"/>
-                <w:color w:val="333333"/>
-                <w:sz w:val="17"/>
-              </w:rPr>
-              <w:t xml:space="preserve">  "notes": "Average order payment uses payments for valid orders in this example."</w:t>
-            </w:r>
-            <w:r>
-              <w:rPr>
-                <w:rFonts w:eastAsia="Hiragino Sans GB"/>
-              </w:rPr>
-              <w:br w:type="textWrapping"/>
-            </w:r>
-            <w:r>
-              <w:rPr>
-                <w:rFonts w:ascii="Liberation Mono" w:hAnsi="Liberation Mono" w:eastAsia="Hiragino Sans GB"/>
-                <w:color w:val="333333"/>
-                <w:sz w:val="17"/>
-              </w:rPr>
+              <w:br/>
+              <w:t xml:space="preserve">  "notes": "This example uses canonical avg_order_payment for valid orders; it is not the existing average_payment_value_per_order baseline."</w:t>
+              <w:br/>
               <w:t>}</w:t>
             </w:r>
           </w:p>
@@ -19685,15 +18725,8 @@
             <w:vAlign w:val="center"/>
           </w:tcPr>
           <w:p>
-            <w:pPr>
-              <w:spacing w:after="0" w:line="252" w:lineRule="auto"/>
-            </w:pPr>
-            <w:r>
-              <w:rPr>
-                <w:rFonts w:ascii="Noto Sans CJK SC" w:hAnsi="Noto Sans CJK SC" w:eastAsia="Hiragino Sans GB"/>
-                <w:sz w:val="16"/>
-              </w:rPr>
-              <w:t>RAG 和业务语义能力。</w:t>
+            <w:r>
+              <w:t>Metric Catalog / business semantics 能力。</w:t>
             </w:r>
           </w:p>
         </w:tc>
@@ -19964,10 +18997,7 @@
         <w:ind w:left="0"/>
       </w:pPr>
       <w:r>
-        <w:rPr>
-          <w:rFonts w:ascii="Noto Sans CJK SC" w:hAnsi="Noto Sans CJK SC" w:eastAsia="Hiragino Sans GB"/>
-        </w:rPr>
-        <w:t>至少 30 条覆盖 6 类任务的标准问题。</w:t>
+        <w:t>最终完整 evaluation set 至少 30 条；在 metric semantics、trend、MoM / YoY、diagnostic、tool routing、repair、adversarial / boundary cases 实现后逐步扩展，不机械扩充当前 16 道题。</w:t>
       </w:r>
     </w:p>
     <w:p>
@@ -20724,15 +19754,8 @@
             <w:vAlign w:val="center"/>
           </w:tcPr>
           <w:p>
-            <w:pPr>
-              <w:spacing w:after="0" w:line="252" w:lineRule="auto"/>
-            </w:pPr>
-            <w:r>
-              <w:rPr>
-                <w:rFonts w:ascii="Noto Sans CJK SC" w:hAnsi="Noto Sans CJK SC" w:eastAsia="Hiragino Sans GB"/>
-                <w:sz w:val="17"/>
-              </w:rPr>
-              <w:t>8 张核心表的 typed DuckDB、3 个 view、14 条 baseline SQL、inspect_schema 和只读 SQL executor 已完成。</w:t>
+            <w:r>
+              <w:t>8 张核心表的 typed DuckDB、3 个 view、14 条 baseline SQL、inspect_schema 和只读 SQL executor 已完成；当前 executor 尚无 timeout / resource quota。</w:t>
             </w:r>
           </w:p>
         </w:tc>
@@ -21000,15 +20023,8 @@
             <w:vAlign w:val="center"/>
           </w:tcPr>
           <w:p>
-            <w:pPr>
-              <w:spacing w:after="0" w:line="252" w:lineRule="auto"/>
-            </w:pPr>
-            <w:r>
-              <w:rPr>
-                <w:rFonts w:ascii="Noto Sans CJK SC" w:hAnsi="Noto Sans CJK SC" w:eastAsia="Hiragino Sans GB"/>
-                <w:sz w:val="17"/>
-              </w:rPr>
-              <w:t>至少 30 条问题和基础指标报告。</w:t>
+            <w:r>
+              <w:t>English Core Gold Set v0.1 已完成：16 questions（14 answerable、2 unanswerable），完整 pytest 63 passed；最终评测集随能力实现逐步扩展到至少 30 条。</w:t>
             </w:r>
           </w:p>
         </w:tc>
@@ -21106,10 +20122,7 @@
         <w:ind w:left="0"/>
       </w:pPr>
       <w:r>
-        <w:rPr>
-          <w:rFonts w:ascii="Noto Sans CJK SC" w:hAnsi="Noto Sans CJK SC" w:eastAsia="Hiragino Sans GB"/>
-        </w:rPr>
-        <w:t>多数据源切换和数据库适配层。</w:t>
+        <w:t>Parquet / multiple data-source support 和数据库适配层；当前 MVP 仅支持 Olist CSV → typed DuckDB。</w:t>
       </w:r>
     </w:p>
     <w:p>
@@ -21158,10 +20171,7 @@
         <w:ind w:left="0"/>
       </w:pPr>
       <w:r>
-        <w:rPr>
-          <w:rFonts w:ascii="Noto Sans CJK SC" w:hAnsi="Noto Sans CJK SC" w:eastAsia="Hiragino Sans GB"/>
-        </w:rPr>
-        <w:t>MCP 工具暴露、Docker 部署、简单用户权限。</w:t>
+        <w:t>MCP 工具暴露、Docker 部署、简单用户权限；MCP 属于 post-MVP，当前本地 DuckDB + Python tools 没有真实 MCP 边界。</w:t>
       </w:r>
     </w:p>
     <w:p>
@@ -21894,15 +20904,8 @@
             <w:vAlign w:val="center"/>
           </w:tcPr>
           <w:p>
-            <w:pPr>
-              <w:spacing w:after="0" w:line="252" w:lineRule="auto"/>
-            </w:pPr>
-            <w:r>
-              <w:rPr>
-                <w:rFonts w:ascii="Noto Sans CJK SC" w:hAnsi="Noto Sans CJK SC" w:eastAsia="Hiragino Sans GB"/>
-                <w:sz w:val="15"/>
-              </w:rPr>
-              <w:t>让模型基于 Schema 生成 SQL。</w:t>
+            <w:r>
+              <w:t>下一阶段：基于现有 schema、executor 和 English Core Gold Set v0.1 实现最小 English LLM Text-to-SQL generation。</w:t>
             </w:r>
           </w:p>
         </w:tc>
@@ -21918,15 +20921,8 @@
             <w:vAlign w:val="center"/>
           </w:tcPr>
           <w:p>
-            <w:pPr>
-              <w:spacing w:after="0" w:line="252" w:lineRule="auto"/>
-            </w:pPr>
-            <w:r>
-              <w:rPr>
-                <w:rFonts w:ascii="Noto Sans CJK SC" w:hAnsi="Noto Sans CJK SC" w:eastAsia="Hiragino Sans GB"/>
-                <w:sz w:val="15"/>
-              </w:rPr>
-              <w:t>English natural language → SQL</w:t>
+            <w:r>
+              <w:t>English natural language → SQL（next stage）</w:t>
             </w:r>
           </w:p>
         </w:tc>
@@ -22310,15 +21306,8 @@
             <w:vAlign w:val="center"/>
           </w:tcPr>
           <w:p>
-            <w:pPr>
-              <w:spacing w:after="0" w:line="252" w:lineRule="auto"/>
-            </w:pPr>
-            <w:r>
-              <w:rPr>
-                <w:rFonts w:ascii="Noto Sans CJK SC" w:hAnsi="Noto Sans CJK SC" w:eastAsia="Hiragino Sans GB"/>
-                <w:sz w:val="15"/>
-              </w:rPr>
-              <w:t>定义至少 6 个业务指标，建立检索工具。</w:t>
+            <w:r>
+              <w:t>定义至少 6 个 canonical business metrics，建立 deterministic catalog / alias / keyword retrieval。</w:t>
             </w:r>
           </w:p>
         </w:tc>
@@ -22334,15 +21323,8 @@
             <w:vAlign w:val="center"/>
           </w:tcPr>
           <w:p>
-            <w:pPr>
-              <w:spacing w:after="0" w:line="252" w:lineRule="auto"/>
-            </w:pPr>
-            <w:r>
-              <w:rPr>
-                <w:rFonts w:ascii="Noto Sans CJK SC" w:hAnsi="Noto Sans CJK SC" w:eastAsia="Hiragino Sans GB"/>
-                <w:sz w:val="15"/>
-              </w:rPr>
-              <w:t>Metric RAG</w:t>
+            <w:r>
+              <w:t>Metric Catalog / Retrieval</w:t>
             </w:r>
           </w:p>
         </w:tc>
@@ -22831,15 +21813,8 @@
             <w:vAlign w:val="center"/>
           </w:tcPr>
           <w:p>
-            <w:pPr>
-              <w:spacing w:after="0" w:line="252" w:lineRule="auto"/>
-            </w:pPr>
-            <w:r>
-              <w:rPr>
-                <w:rFonts w:ascii="Noto Sans CJK SC" w:hAnsi="Noto Sans CJK SC" w:eastAsia="Hiragino Sans GB"/>
-                <w:sz w:val="15"/>
-              </w:rPr>
-              <w:t>使用 LangGraph 或显式状态机串联所有节点。</w:t>
+            <w:r>
+              <w:t>以 single Agent + explicit workflow/state 串联节点；到 integration 阶段优先考虑 LangGraph。</w:t>
             </w:r>
           </w:p>
         </w:tc>
@@ -23142,15 +22117,8 @@
             <w:vAlign w:val="center"/>
           </w:tcPr>
           <w:p>
-            <w:pPr>
-              <w:spacing w:after="0" w:line="252" w:lineRule="auto"/>
-            </w:pPr>
-            <w:r>
-              <w:rPr>
-                <w:rFonts w:ascii="Noto Sans CJK SC" w:hAnsi="Noto Sans CJK SC" w:eastAsia="Hiragino Sans GB"/>
-                <w:sz w:val="15"/>
-              </w:rPr>
-              <w:t>编写 30 条问题和基准答案 / SQL。</w:t>
+            <w:r>
+              <w:t>已完成 English Core Gold Set v0.1（16 questions）；随新能力实现逐步扩展，最终至少 30 条。</w:t>
             </w:r>
           </w:p>
         </w:tc>
@@ -23166,15 +22134,8 @@
             <w:vAlign w:val="center"/>
           </w:tcPr>
           <w:p>
-            <w:pPr>
-              <w:spacing w:after="0" w:line="252" w:lineRule="auto"/>
-            </w:pPr>
-            <w:r>
-              <w:rPr>
-                <w:rFonts w:ascii="Noto Sans CJK SC" w:hAnsi="Noto Sans CJK SC" w:eastAsia="Hiragino Sans GB"/>
-                <w:sz w:val="15"/>
-              </w:rPr>
-              <w:t>cases.jsonl</w:t>
+            <w:r>
+              <w:t>已完成：16 questions；30+ phased target</w:t>
             </w:r>
           </w:p>
         </w:tc>
@@ -24467,10 +23428,7 @@
         <w:ind w:left="0"/>
       </w:pPr>
       <w:r>
-        <w:rPr>
-          <w:rFonts w:ascii="Noto Sans CJK SC" w:hAnsi="Noto Sans CJK SC" w:eastAsia="Hiragino Sans GB"/>
-        </w:rPr>
-        <w:t>基于 LangGraph（或实际采用框架）构建面向结构化业务数据的多工具 Agent，实现数据库 Schema 自主识别、业务指标 RAG 检索、只读 SQL 生成与执行、Python 趋势 / 异常分析及图表生成；设计 SQL 错误自修复、结果一致性校验和调用链追踪，并通过标准问题集评估工具选择准确率、数值正确率与响应延迟。</w:t>
+        <w:t>基于实际采用的 single-Agent workflow 构建面向结构化业务数据的多工具 Agent，实现 Schema inspection、Metric Catalog / Retrieval、只读 SQL、受控 Python 分析、结果验证与调用链追踪；仅在真实采用后写 LangGraph、LangChain 或 vector RAG，并通过标准问题集报告真实评测结果。</w:t>
       </w:r>
     </w:p>
     <w:p>
@@ -24714,15 +23672,8 @@
             <w:vAlign w:val="center"/>
           </w:tcPr>
           <w:p>
-            <w:pPr>
-              <w:spacing w:after="0" w:line="252" w:lineRule="auto"/>
-            </w:pPr>
-            <w:r>
-              <w:rPr>
-                <w:rFonts w:ascii="Noto Sans CJK SC" w:hAnsi="Noto Sans CJK SC" w:eastAsia="Hiragino Sans GB"/>
-                <w:sz w:val="16"/>
-              </w:rPr>
-              <w:t>为什么需要指标 RAG？</w:t>
+            <w:r>
+              <w:t>为什么需要 Metric Catalog / Retrieval？</w:t>
             </w:r>
           </w:p>
         </w:tc>
@@ -24738,15 +23689,8 @@
             <w:vAlign w:val="center"/>
           </w:tcPr>
           <w:p>
-            <w:pPr>
-              <w:spacing w:after="0" w:line="252" w:lineRule="auto"/>
-            </w:pPr>
-            <w:r>
-              <w:rPr>
-                <w:rFonts w:ascii="Noto Sans CJK SC" w:hAnsi="Noto Sans CJK SC" w:eastAsia="Hiragino Sans GB"/>
-                <w:sz w:val="16"/>
-              </w:rPr>
-              <w:t>Schema 只能说明字段，不能说明业务口径；RAG 用于区分商品金额、支付金额、客单价和取消订单率。</w:t>
+            <w:r>
+              <w:t>Schema 只能说明字段，不能说明业务口径；MVP 用 deterministic catalog / alias / keyword retrieval 区分商品金额、支付金额、客单价和取消订单率，vector RAG 仅为未来增强。</w:t>
             </w:r>
           </w:p>
         </w:tc>
@@ -24794,15 +23738,8 @@
             <w:vAlign w:val="center"/>
           </w:tcPr>
           <w:p>
-            <w:pPr>
-              <w:spacing w:after="0" w:line="252" w:lineRule="auto"/>
-            </w:pPr>
-            <w:r>
-              <w:rPr>
-                <w:rFonts w:ascii="Noto Sans CJK SC" w:hAnsi="Noto Sans CJK SC" w:eastAsia="Hiragino Sans GB"/>
-                <w:sz w:val="16"/>
-              </w:rPr>
-              <w:t>只读连接 + 白名单 + AST / 关键词校验 + 单语句 + 超时 / 行数限制。</w:t>
+            <w:r>
+              <w:t>只读连接 + allowlist + DuckDB parser + 单语句 + fetchmany 行数边界；query timeout / resource quota 尚未实现。</w:t>
             </w:r>
           </w:p>
         </w:tc>
@@ -25679,9 +24616,9 @@
           </w:tcPr>
           <w:p>
             <w:r>
-              <w:t>P0 / P1 / DuckDB 最小基线</w:t>
+              <w:t>P0 / P1 / Deterministic agent foundation</w:t>
               <w:br/>
-              <w:t>项目只在个人电脑和本地 Git 仓库中开发；唯一数据集为 Olist。数据审计、typed DuckDB、订单级安全聚合、14 条 baseline SQL 和数据库测试已完成。当前阶段仍不实现 LangGraph、多 Agent 或前端。</w:t>
+              <w:t>项目只在个人电脑和本地 Git 仓库中开发；唯一数据集为 Olist。typed DuckDB、订单级安全聚合、14 条 baseline SQL、inspect_schema、read-only SQL executor 和 English Core Gold Set v0.1（16 questions）已完成，完整 pytest 63 passed。下一阶段仅为 minimal English LLM Text-to-SQL generation；当前不提前引入 LangGraph、LangChain、Multi-Agent、MCP 或 vector RAG。</w:t>
             </w:r>
           </w:p>
         </w:tc>
@@ -25778,6 +24715,18 @@
     <w:p>
       <w:r>
         <w:t>8. 实现确定性的 inspect_schema；核心对象、字段类型、缺失数据库和稳定输出测试通过。</w:t>
+      </w:r>
+    </w:p>
+    <w:p>
+      <w:pPr/>
+      <w:r>
+        <w:t>9. 实现确定性的只读 SQL executor；单条 SELECT / WITH、危险语句、行数截断和结构化错误测试通过；query timeout / resource quota 尚未实现。</w:t>
+      </w:r>
+    </w:p>
+    <w:p>
+      <w:pPr/>
+      <w:r>
+        <w:t>10. English Core Gold Set v0.1 已完成：16 questions（14 answerable、2 unanswerable）；全量 pytest 63 passed。当前状态：Deterministic agent foundation + English Core Gold Set completed; next stage is minimal English LLM Text-to-SQL generation.</w:t>
       </w:r>
     </w:p>
     <w:p>
@@ -26166,7 +25115,7 @@
         <w:color w:val="777777"/>
         <w:sz w:val="16"/>
       </w:rPr>
-      <w:t xml:space="preserve"> 产品需求与技术方案  |  v1.4  |  第 </w:t>
+      <w:t xml:space="preserve"> 产品需求与技术方案  |  v1.5  |  第 </w:t>
     </w:r>
     <w:r>
       <w:rPr>

</xml_diff>